<commit_message>
correcion de informe apt
se agrega tabla de riesgos
</commit_message>
<xml_diff>
--- a/Fase 2/Evidencias Grupales/INFORME FINAL PROYECTO APT (avance 2).docx
+++ b/Fase 2/Evidencias Grupales/INFORME FINAL PROYECTO APT (avance 2).docx
@@ -125,13 +125,8 @@
             <w:hideMark/>
           </w:tcPr>
           <w:p>
-            <w:proofErr w:type="spellStart"/>
-            <w:r>
-              <w:t>SmartSwim</w:t>
-            </w:r>
-            <w:proofErr w:type="spellEnd"/>
-            <w:r>
-              <w:t xml:space="preserve"> - Asistente Inteligente de Entrenamiento para Nadadores</w:t>
+            <w:r>
+              <w:t>SmartSwim - Asistente Inteligente de Entrenamiento para Nadadores</w:t>
             </w:r>
           </w:p>
         </w:tc>
@@ -308,15 +303,7 @@
     </w:p>
     <w:p>
       <w:r>
-        <w:t xml:space="preserve">El proyecto se sitúa en Chile, específicamente en la Región Metropolitana, caracterizada por una creciente comunidad de </w:t>
-      </w:r>
-      <w:proofErr w:type="gramStart"/>
-      <w:r>
-        <w:t>natación</w:t>
-      </w:r>
-      <w:proofErr w:type="gramEnd"/>
-      <w:r>
-        <w:t xml:space="preserve"> pero con limitado acceso a entrenamiento especializado fuera de clubes de elite.</w:t>
+        <w:t>El proyecto se sitúa en Chile, específicamente en la Región Metropolitana, caracterizada por una creciente comunidad de natación pero con limitado acceso a entrenamiento especializado fuera de clubes de elite.</w:t>
       </w:r>
     </w:p>
     <w:p/>
@@ -455,15 +442,7 @@
             </w:r>
             <w:r>
               <w:br/>
-              <w:t xml:space="preserve">- Arquitectura </w:t>
-            </w:r>
-            <w:proofErr w:type="spellStart"/>
-            <w:r>
-              <w:t>on</w:t>
-            </w:r>
-            <w:proofErr w:type="spellEnd"/>
-            <w:r>
-              <w:t>-premise (mayor seguridad)</w:t>
+              <w:t>- Arquitectura on-premise (mayor seguridad)</w:t>
             </w:r>
             <w:r>
               <w:br/>
@@ -475,31 +454,7 @@
             </w:r>
             <w:r>
               <w:br/>
-              <w:t xml:space="preserve">- </w:t>
-            </w:r>
-            <w:proofErr w:type="spellStart"/>
-            <w:r>
-              <w:t>Stack</w:t>
-            </w:r>
-            <w:proofErr w:type="spellEnd"/>
-            <w:r>
-              <w:t xml:space="preserve"> moderno (</w:t>
-            </w:r>
-            <w:proofErr w:type="spellStart"/>
-            <w:r>
-              <w:t>React</w:t>
-            </w:r>
-            <w:proofErr w:type="spellEnd"/>
-            <w:r>
-              <w:t xml:space="preserve"> Native + </w:t>
-            </w:r>
-            <w:proofErr w:type="spellStart"/>
-            <w:r>
-              <w:t>FastAPI</w:t>
-            </w:r>
-            <w:proofErr w:type="spellEnd"/>
-            <w:r>
-              <w:t>)</w:t>
+              <w:t>- Stack moderno (React Native + FastAPI)</w:t>
             </w:r>
             <w:r>
               <w:br/>
@@ -607,24 +562,11 @@
             </w:r>
             <w:r>
               <w:br/>
-              <w:t xml:space="preserve">- Integración con </w:t>
-            </w:r>
-            <w:proofErr w:type="gramStart"/>
-            <w:r>
-              <w:t>wearables</w:t>
-            </w:r>
-            <w:proofErr w:type="gramEnd"/>
+              <w:t>- Integración con wearables</w:t>
+            </w:r>
             <w:r>
               <w:br/>
-              <w:t xml:space="preserve">- Machine </w:t>
-            </w:r>
-            <w:proofErr w:type="spellStart"/>
-            <w:r>
-              <w:t>Learning</w:t>
-            </w:r>
-            <w:proofErr w:type="spellEnd"/>
-            <w:r>
-              <w:t xml:space="preserve"> predictivo</w:t>
+              <w:t>- Machine Learning predictivo</w:t>
             </w:r>
             <w:r>
               <w:br/>
@@ -693,13 +635,8 @@
             </w:r>
             <w:r>
               <w:br/>
-              <w:t xml:space="preserve">- Colaboración con </w:t>
-            </w:r>
-            <w:proofErr w:type="spellStart"/>
-            <w:r>
-              <w:t>MySwimPro</w:t>
-            </w:r>
-            <w:proofErr w:type="spellEnd"/>
+              <w:t>- Colaboración con MySwimPro</w:t>
+            </w:r>
             <w:r>
               <w:br/>
               <w:t>- Integración con Swim.com</w:t>
@@ -853,47 +790,15 @@
             </w:r>
             <w:r>
               <w:br/>
-              <w:t xml:space="preserve">- </w:t>
-            </w:r>
-            <w:proofErr w:type="spellStart"/>
-            <w:r>
-              <w:t>MySwimPro</w:t>
-            </w:r>
-            <w:proofErr w:type="spellEnd"/>
-            <w:r>
-              <w:t xml:space="preserve"> (5M+ usuarios, $10M+ </w:t>
-            </w:r>
-            <w:proofErr w:type="spellStart"/>
-            <w:r>
-              <w:t>funding</w:t>
-            </w:r>
-            <w:proofErr w:type="spellEnd"/>
-            <w:r>
-              <w:t>)</w:t>
+              <w:t>- MySwimPro (5M+ usuarios, $10M+ funding)</w:t>
             </w:r>
             <w:r>
               <w:br/>
-              <w:t>- Swim.com (</w:t>
-            </w:r>
-            <w:proofErr w:type="gramStart"/>
-            <w:r>
-              <w:t>especialización wearables</w:t>
-            </w:r>
-            <w:proofErr w:type="gramEnd"/>
-            <w:r>
-              <w:t>)</w:t>
+              <w:t>- Swim.com (especialización wearables)</w:t>
             </w:r>
             <w:r>
               <w:br/>
-              <w:t xml:space="preserve">- </w:t>
-            </w:r>
-            <w:proofErr w:type="spellStart"/>
-            <w:r>
-              <w:t>SwimUp</w:t>
-            </w:r>
-            <w:proofErr w:type="spellEnd"/>
-            <w:r>
-              <w:t xml:space="preserve"> (técnica con IA)</w:t>
+              <w:t>- SwimUp (técnica con IA)</w:t>
             </w:r>
             <w:r>
               <w:br/>
@@ -1005,15 +910,7 @@
             </w:r>
             <w:r>
               <w:br/>
-              <w:t xml:space="preserve">- Brand </w:t>
-            </w:r>
-            <w:proofErr w:type="spellStart"/>
-            <w:r>
-              <w:t>awareness</w:t>
-            </w:r>
-            <w:proofErr w:type="spellEnd"/>
-            <w:r>
-              <w:t xml:space="preserve"> nulo</w:t>
+              <w:t>- Brand awareness nulo</w:t>
             </w:r>
             <w:r>
               <w:br/>
@@ -1043,21 +940,8 @@
             </w:r>
             <w:r>
               <w:br/>
-              <w:t xml:space="preserve">- Cambios políticas </w:t>
-            </w:r>
-            <w:proofErr w:type="gramStart"/>
-            <w:r>
-              <w:t>app</w:t>
-            </w:r>
-            <w:proofErr w:type="gramEnd"/>
-            <w:r>
-              <w:t xml:space="preserve"> </w:t>
-            </w:r>
-            <w:proofErr w:type="spellStart"/>
-            <w:r>
-              <w:t>stores</w:t>
-            </w:r>
-            <w:proofErr w:type="spellEnd"/>
+              <w:t>- Cambios políticas app stores</w:t>
+            </w:r>
             <w:r>
               <w:br/>
               <w:t>- Vulnerabilidades seguridad</w:t>
@@ -1087,77 +971,8 @@
       </w:r>
     </w:p>
     <w:p>
-      <w:proofErr w:type="spellStart"/>
-      <w:r>
-        <w:t>SmartSwim</w:t>
-      </w:r>
-      <w:proofErr w:type="spellEnd"/>
-      <w:r>
-        <w:t xml:space="preserve"> se posiciona con precios competitivos respecto a </w:t>
-      </w:r>
-      <w:proofErr w:type="spellStart"/>
-      <w:r>
-        <w:t>MySwimPro</w:t>
-      </w:r>
-      <w:proofErr w:type="spellEnd"/>
-      <w:r>
-        <w:t xml:space="preserve">, </w:t>
-      </w:r>
-      <w:proofErr w:type="spellStart"/>
-      <w:r>
-        <w:t>SwimUp</w:t>
-      </w:r>
-      <w:proofErr w:type="spellEnd"/>
-      <w:r>
-        <w:t xml:space="preserve"> y Swim.com. </w:t>
-      </w:r>
-      <w:proofErr w:type="spellStart"/>
-      <w:r>
-        <w:t>MySwimPro</w:t>
-      </w:r>
-      <w:proofErr w:type="spellEnd"/>
-      <w:r>
-        <w:t xml:space="preserve"> ofrece suscripciones mensuales ($19) y anuales ($179), Swim.com es </w:t>
-      </w:r>
-      <w:proofErr w:type="gramStart"/>
-      <w:r>
-        <w:t>gratuita</w:t>
-      </w:r>
-      <w:proofErr w:type="gramEnd"/>
-      <w:r>
-        <w:t xml:space="preserve"> pero requiere dispositivos premium y </w:t>
-      </w:r>
-      <w:proofErr w:type="spellStart"/>
-      <w:r>
-        <w:t>SwimUp</w:t>
-      </w:r>
-      <w:proofErr w:type="spellEnd"/>
-      <w:r>
-        <w:t xml:space="preserve"> aplica un modelo </w:t>
-      </w:r>
-      <w:proofErr w:type="spellStart"/>
-      <w:r>
-        <w:t>freemium</w:t>
-      </w:r>
-      <w:proofErr w:type="spellEnd"/>
-      <w:r>
-        <w:t xml:space="preserve"> con </w:t>
-      </w:r>
-      <w:proofErr w:type="spellStart"/>
-      <w:r>
-        <w:t>add-ons</w:t>
-      </w:r>
-      <w:proofErr w:type="spellEnd"/>
-      <w:r>
-        <w:t xml:space="preserve"> técnicos. </w:t>
-      </w:r>
-      <w:proofErr w:type="spellStart"/>
-      <w:r>
-        <w:t>SmartSwim</w:t>
-      </w:r>
-      <w:proofErr w:type="spellEnd"/>
-      <w:r>
-        <w:t xml:space="preserve"> podría proponer precios mensuales del orden de $5-$8 y alianzas con clubes, lo cual lo haría más accesible para el segmento latinoamericano y diferenciaría su modelo económico.</w:t>
+      <w:r>
+        <w:t>SmartSwim se posiciona con precios competitivos respecto a MySwimPro, SwimUp y Swim.com. MySwimPro ofrece suscripciones mensuales ($19) y anuales ($179), Swim.com es gratuita pero requiere dispositivos premium y SwimUp aplica un modelo freemium con add-ons técnicos. SmartSwim podría proponer precios mensuales del orden de $5-$8 y alianzas con clubes, lo cual lo haría más accesible para el segmento latinoamericano y diferenciaría su modelo económico.</w:t>
       </w:r>
       <w:hyperlink r:id="rId5" w:tgtFrame="_blank" w:history="1">
         <w:r>
@@ -1185,31 +1000,7 @@
     </w:p>
     <w:p>
       <w:r>
-        <w:t xml:space="preserve">El despliegue y la adopción de </w:t>
-      </w:r>
-      <w:proofErr w:type="spellStart"/>
-      <w:r>
-        <w:t>SmartSwim</w:t>
-      </w:r>
-      <w:proofErr w:type="spellEnd"/>
-      <w:r>
-        <w:t xml:space="preserve"> se ven influenciados por normativas locales sobre manejo de datos personales, certificaciones deportivas y distribución en </w:t>
-      </w:r>
-      <w:proofErr w:type="gramStart"/>
-      <w:r>
-        <w:t>app</w:t>
-      </w:r>
-      <w:proofErr w:type="gramEnd"/>
-      <w:r>
-        <w:t xml:space="preserve"> </w:t>
-      </w:r>
-      <w:proofErr w:type="spellStart"/>
-      <w:r>
-        <w:t>stores</w:t>
-      </w:r>
-      <w:proofErr w:type="spellEnd"/>
-      <w:r>
-        <w:t>. Es crítico asegurar el cumplimiento con legislación de protección de datos (LGPD, GDPR), garantizar la interoperabilidad técnica con federaciones y mantenerse actualizado ante posibles cambios regulatorios, para evitar bloqueos operativos o de comercialización.</w:t>
+        <w:t>El despliegue y la adopción de SmartSwim se ven influenciados por normativas locales sobre manejo de datos personales, certificaciones deportivas y distribución en app stores. Es crítico asegurar el cumplimiento con legislación de protección de datos (LGPD, GDPR), garantizar la interoperabilidad técnica con federaciones y mantenerse actualizado ante posibles cambios regulatorios, para evitar bloqueos operativos o de comercialización.</w:t>
       </w:r>
       <w:hyperlink r:id="rId6" w:tgtFrame="_blank" w:history="1">
         <w:r>
@@ -1236,21 +1027,8 @@
       </w:r>
     </w:p>
     <w:p>
-      <w:proofErr w:type="spellStart"/>
-      <w:r>
-        <w:t>SmartSwim</w:t>
-      </w:r>
-      <w:proofErr w:type="spellEnd"/>
-      <w:r>
-        <w:t xml:space="preserve"> depende de modelos Gemma3, que pueden quedar obsoletos frente a avances rápidos de IA, lo que exige monitoreo constante y actualización tecnológica. Además, la seguridad debe fortalecerse para resistir vulnerabilidades emergentes y adoptar estrategias de contingencia ante la dependencia de </w:t>
-      </w:r>
-      <w:proofErr w:type="spellStart"/>
-      <w:r>
-        <w:t>APIs</w:t>
-      </w:r>
-      <w:proofErr w:type="spellEnd"/>
-      <w:r>
-        <w:t xml:space="preserve"> de terceros y cambios de políticas en plataformas de distribución móvil.</w:t>
+      <w:r>
+        <w:t>SmartSwim depende de modelos Gemma3, que pueden quedar obsoletos frente a avances rápidos de IA, lo que exige monitoreo constante y actualización tecnológica. Además, la seguridad debe fortalecerse para resistir vulnerabilidades emergentes y adoptar estrategias de contingencia ante la dependencia de APIs de terceros y cambios de políticas en plataformas de distribución móvil.</w:t>
       </w:r>
       <w:hyperlink r:id="rId7" w:tgtFrame="_blank" w:history="1">
         <w:r>
@@ -1278,15 +1056,7 @@
     </w:p>
     <w:p>
       <w:r>
-        <w:t xml:space="preserve">Aparte de suscripciones, </w:t>
-      </w:r>
-      <w:proofErr w:type="spellStart"/>
-      <w:r>
-        <w:t>SmartSwim</w:t>
-      </w:r>
-      <w:proofErr w:type="spellEnd"/>
-      <w:r>
-        <w:t xml:space="preserve"> puede monetizar con la venta de datos anónimos para estudios académicos, alianzas comerciales con marcas deportivas, o servicios de consultoría premium para entrenadores y clubes. Explorar patrocinios y la organización de eventos en línea puede diversificar y fortalecer sus ingresos a largo plazo.</w:t>
+        <w:t>Aparte de suscripciones, SmartSwim puede monetizar con la venta de datos anónimos para estudios académicos, alianzas comerciales con marcas deportivas, o servicios de consultoría premium para entrenadores y clubes. Explorar patrocinios y la organización de eventos en línea puede diversificar y fortalecer sus ingresos a largo plazo.</w:t>
       </w:r>
       <w:hyperlink r:id="rId8" w:tgtFrame="_blank" w:history="1">
         <w:r>
@@ -1399,23 +1169,7 @@
           </w:tcPr>
           <w:p>
             <w:r>
-              <w:t xml:space="preserve">- FO1: Versión </w:t>
-            </w:r>
-            <w:proofErr w:type="spellStart"/>
-            <w:r>
-              <w:t>enterprise</w:t>
-            </w:r>
-            <w:proofErr w:type="spellEnd"/>
-            <w:r>
-              <w:t xml:space="preserve"> enfocada en clubes, aprovechando despliegue </w:t>
-            </w:r>
-            <w:proofErr w:type="spellStart"/>
-            <w:r>
-              <w:t>on</w:t>
-            </w:r>
-            <w:proofErr w:type="spellEnd"/>
-            <w:r>
-              <w:t>-</w:t>
+              <w:t>- FO1: Versión enterprise enfocada en clubes, aprovechando despliegue on-</w:t>
             </w:r>
             <w:r>
               <w:lastRenderedPageBreak/>
@@ -1423,15 +1177,7 @@
             </w:r>
             <w:r>
               <w:br/>
-              <w:t xml:space="preserve">- FO2: API para integración directa con </w:t>
-            </w:r>
-            <w:proofErr w:type="gramStart"/>
-            <w:r>
-              <w:t>wearables</w:t>
-            </w:r>
-            <w:proofErr w:type="gramEnd"/>
-            <w:r>
-              <w:t xml:space="preserve"> y federaciones.</w:t>
+              <w:t>- FO2: API para integración directa con wearables y federaciones.</w:t>
             </w:r>
             <w:r>
               <w:br/>
@@ -1456,23 +1202,7 @@
             </w:r>
             <w:r>
               <w:br/>
-              <w:t>- DO2: Migración hacia arquitectura híbrida (</w:t>
-            </w:r>
-            <w:proofErr w:type="spellStart"/>
-            <w:r>
-              <w:t>cloud</w:t>
-            </w:r>
-            <w:proofErr w:type="spellEnd"/>
-            <w:r>
-              <w:t>/</w:t>
-            </w:r>
-            <w:proofErr w:type="spellStart"/>
-            <w:r>
-              <w:t>on</w:t>
-            </w:r>
-            <w:proofErr w:type="spellEnd"/>
-            <w:r>
-              <w:t>-premise) para escalabilidad.</w:t>
+              <w:t>- DO2: Migración hacia arquitectura híbrida (cloud/on-premise) para escalabilidad.</w:t>
             </w:r>
             <w:r>
               <w:br/>
@@ -1575,15 +1305,7 @@
           </w:tcPr>
           <w:p>
             <w:r>
-              <w:t xml:space="preserve">- FA1: Privacidad superior frente a competidores </w:t>
-            </w:r>
-            <w:proofErr w:type="spellStart"/>
-            <w:r>
-              <w:t>cloud</w:t>
-            </w:r>
-            <w:proofErr w:type="spellEnd"/>
-            <w:r>
-              <w:t>, asegurando retención de clientes preocupados por datos.</w:t>
+              <w:t>- FA1: Privacidad superior frente a competidores cloud, asegurando retención de clientes preocupados por datos.</w:t>
             </w:r>
             <w:r>
               <w:br/>
@@ -1603,47 +1325,15 @@
           </w:tcPr>
           <w:p>
             <w:r>
-              <w:t>- DA1: Enfoque en nichos de alto compromiso (</w:t>
-            </w:r>
-            <w:proofErr w:type="gramStart"/>
-            <w:r>
-              <w:t>masters</w:t>
-            </w:r>
-            <w:proofErr w:type="gramEnd"/>
-            <w:r>
-              <w:t>, triatletas) para penetrar mercados específicos.</w:t>
+              <w:t>- DA1: Enfoque en nichos de alto compromiso (masters, triatletas) para penetrar mercados específicos.</w:t>
             </w:r>
             <w:r>
               <w:br/>
-              <w:t xml:space="preserve">- DA2: Oferta de funcionalidades mínimas y precio competitivo para captar </w:t>
-            </w:r>
-            <w:proofErr w:type="spellStart"/>
-            <w:r>
-              <w:t>early</w:t>
-            </w:r>
-            <w:proofErr w:type="spellEnd"/>
-            <w:r>
-              <w:t xml:space="preserve"> </w:t>
-            </w:r>
-            <w:proofErr w:type="spellStart"/>
-            <w:r>
-              <w:t>adopters</w:t>
-            </w:r>
-            <w:proofErr w:type="spellEnd"/>
-            <w:r>
-              <w:t>.</w:t>
+              <w:t>- DA2: Oferta de funcionalidades mínimas y precio competitivo para captar early adopters.</w:t>
             </w:r>
             <w:r>
               <w:br/>
-              <w:t xml:space="preserve">- DA3: Creación de comunidad online y eventos virtuales para fortalecer retención y </w:t>
-            </w:r>
-            <w:proofErr w:type="spellStart"/>
-            <w:r>
-              <w:t>engagement</w:t>
-            </w:r>
-            <w:proofErr w:type="spellEnd"/>
-            <w:r>
-              <w:t>.</w:t>
+              <w:t>- DA3: Creación de comunidad online y eventos virtuales para fortalecer retención y engagement.</w:t>
             </w:r>
           </w:p>
         </w:tc>
@@ -1652,7 +1342,7 @@
     <w:p>
       <w:r>
         <w:pict w14:anchorId="05B009AF">
-          <v:rect id="_x0000_i1051" style="width:0;height:1.5pt" o:hralign="center" o:hrstd="t" o:hr="t" fillcolor="#a0a0a0" stroked="f"/>
+          <v:rect id="_x0000_i1025" style="width:0;height:1.5pt" o:hralign="center" o:hrstd="t" o:hr="t" fillcolor="#a0a0a0" stroked="f"/>
         </w:pict>
       </w:r>
     </w:p>
@@ -1666,14 +1356,7 @@
       </w:r>
       <w:r>
         <w:br/>
-      </w:r>
-      <w:proofErr w:type="spellStart"/>
-      <w:r>
-        <w:t>SmartSwim</w:t>
-      </w:r>
-      <w:proofErr w:type="spellEnd"/>
-      <w:r>
-        <w:t xml:space="preserve"> </w:t>
+        <w:t xml:space="preserve">SmartSwim </w:t>
       </w:r>
       <w:r>
         <w:t>se enfoca</w:t>
@@ -1792,31 +1475,7 @@
         <w:t xml:space="preserve"> nuestras competencias, las cuales son</w:t>
       </w:r>
       <w:r>
-        <w:t xml:space="preserve"> </w:t>
-      </w:r>
-      <w:proofErr w:type="spellStart"/>
-      <w:r>
-        <w:t>MySwimPro</w:t>
-      </w:r>
-      <w:proofErr w:type="spellEnd"/>
-      <w:r>
-        <w:t xml:space="preserve">, Swim.com y </w:t>
-      </w:r>
-      <w:proofErr w:type="spellStart"/>
-      <w:r>
-        <w:t>SwimUp</w:t>
-      </w:r>
-      <w:proofErr w:type="spellEnd"/>
-      <w:r>
-        <w:t xml:space="preserve">, basados en </w:t>
-      </w:r>
-      <w:proofErr w:type="spellStart"/>
-      <w:r>
-        <w:t>benchmarks</w:t>
-      </w:r>
-      <w:proofErr w:type="spellEnd"/>
-      <w:r>
-        <w:t xml:space="preserve"> recientes de la industria y referencias para aplicaciones deportivas con inteligencia artificial:</w:t>
+        <w:t xml:space="preserve"> MySwimPro, Swim.com y SwimUp, basados en benchmarks recientes de la industria y referencias para aplicaciones deportivas con inteligencia artificial:</w:t>
       </w:r>
       <w:hyperlink r:id="rId15" w:tgtFrame="_blank" w:history="1">
         <w:r>
@@ -1834,7 +1493,6 @@
           <w:bCs/>
         </w:rPr>
       </w:pPr>
-      <w:proofErr w:type="spellStart"/>
       <w:r>
         <w:rPr>
           <w:b/>
@@ -1842,7 +1500,6 @@
         </w:rPr>
         <w:t>MySwimPro</w:t>
       </w:r>
-      <w:proofErr w:type="spellEnd"/>
     </w:p>
     <w:p>
       <w:pPr>
@@ -1867,151 +1524,7 @@
         </w:numPr>
       </w:pPr>
       <w:r>
-        <w:t xml:space="preserve">Desarrollo inicial: USD 120.000 - 250.000 (incluye IA, integración multiplataforma, </w:t>
-      </w:r>
-      <w:proofErr w:type="spellStart"/>
-      <w:r>
-        <w:t>backend</w:t>
-      </w:r>
-      <w:proofErr w:type="spellEnd"/>
-      <w:r>
-        <w:t xml:space="preserve"> robusto y gestión de datos).</w:t>
-      </w:r>
-      <w:proofErr w:type="spellStart"/>
-      <w:r>
-        <w:fldChar w:fldCharType="begin"/>
-      </w:r>
-      <w:r>
-        <w:instrText>HYPERLINK "https://risingmax.com/es/blog/how-much-does-it-cost-to-develop-an-ai-app" \t "_blank"</w:instrText>
-      </w:r>
-      <w:r>
-        <w:fldChar w:fldCharType="separate"/>
-      </w:r>
-      <w:r>
-        <w:rPr>
-          <w:rStyle w:val="Hipervnculo"/>
-        </w:rPr>
-        <w:t>risingmax</w:t>
-      </w:r>
-      <w:proofErr w:type="spellEnd"/>
-      <w:r>
-        <w:fldChar w:fldCharType="end"/>
-      </w:r>
-    </w:p>
-    <w:p>
-      <w:pPr>
-        <w:numPr>
-          <w:ilvl w:val="1"/>
-          <w:numId w:val="3"/>
-        </w:numPr>
-      </w:pPr>
-      <w:r>
-        <w:t>Costos de actualización/mantenimiento anual: USD 15.000 - 35.000.</w:t>
-      </w:r>
-    </w:p>
-    <w:p>
-      <w:pPr>
-        <w:numPr>
-          <w:ilvl w:val="0"/>
-          <w:numId w:val="3"/>
-        </w:numPr>
-      </w:pPr>
-      <w:r>
-        <w:rPr>
-          <w:b/>
-          <w:bCs/>
-        </w:rPr>
-        <w:t>Equipo típico y sueldos mensuales:</w:t>
-      </w:r>
-    </w:p>
-    <w:p>
-      <w:pPr>
-        <w:numPr>
-          <w:ilvl w:val="1"/>
-          <w:numId w:val="3"/>
-        </w:numPr>
-      </w:pPr>
-      <w:r>
-        <w:t xml:space="preserve">1 </w:t>
-      </w:r>
-      <w:proofErr w:type="spellStart"/>
-      <w:r>
-        <w:t>Product</w:t>
-      </w:r>
-      <w:proofErr w:type="spellEnd"/>
-      <w:r>
-        <w:t xml:space="preserve"> Manager: USD 6.000</w:t>
-      </w:r>
-    </w:p>
-    <w:p>
-      <w:pPr>
-        <w:numPr>
-          <w:ilvl w:val="1"/>
-          <w:numId w:val="3"/>
-        </w:numPr>
-      </w:pPr>
-      <w:r>
-        <w:t>2-3 Desarrolladores Mobile (iOS/Android): USD 4.000 - 6.000 cada uno</w:t>
-      </w:r>
-    </w:p>
-    <w:p>
-      <w:pPr>
-        <w:numPr>
-          <w:ilvl w:val="1"/>
-          <w:numId w:val="3"/>
-        </w:numPr>
-      </w:pPr>
-      <w:r>
-        <w:t xml:space="preserve">1 </w:t>
-      </w:r>
-      <w:proofErr w:type="gramStart"/>
-      <w:r>
-        <w:t>Especialista</w:t>
-      </w:r>
-      <w:proofErr w:type="gramEnd"/>
-      <w:r>
-        <w:t xml:space="preserve"> en IA/Datos: USD 6.000</w:t>
-      </w:r>
-    </w:p>
-    <w:p>
-      <w:pPr>
-        <w:numPr>
-          <w:ilvl w:val="1"/>
-          <w:numId w:val="3"/>
-        </w:numPr>
-      </w:pPr>
-      <w:r>
-        <w:t xml:space="preserve">1 </w:t>
-      </w:r>
-      <w:proofErr w:type="spellStart"/>
-      <w:r>
-        <w:t>Backend</w:t>
-      </w:r>
-      <w:proofErr w:type="spellEnd"/>
-      <w:r>
-        <w:t>/API: USD 5.000</w:t>
-      </w:r>
-    </w:p>
-    <w:p>
-      <w:pPr>
-        <w:numPr>
-          <w:ilvl w:val="1"/>
-          <w:numId w:val="3"/>
-        </w:numPr>
-      </w:pPr>
-      <w:r>
-        <w:t>1 QA y soporte: USD 3.000</w:t>
-      </w:r>
-    </w:p>
-    <w:p>
-      <w:pPr>
-        <w:numPr>
-          <w:ilvl w:val="1"/>
-          <w:numId w:val="3"/>
-        </w:numPr>
-      </w:pPr>
-      <w:r>
-        <w:t>1 UX/UI: USD 3.500</w:t>
+        <w:t>Desarrollo inicial: USD 120.000 - 250.000 (incluye IA, integración multiplataforma, backend robusto y gestión de datos).</w:t>
       </w:r>
       <w:hyperlink r:id="rId16" w:tgtFrame="_blank" w:history="1">
         <w:r>
@@ -2024,6 +1537,106 @@
     </w:p>
     <w:p>
       <w:pPr>
+        <w:numPr>
+          <w:ilvl w:val="1"/>
+          <w:numId w:val="3"/>
+        </w:numPr>
+      </w:pPr>
+      <w:r>
+        <w:t>Costos de actualización/mantenimiento anual: USD 15.000 - 35.000.</w:t>
+      </w:r>
+    </w:p>
+    <w:p>
+      <w:pPr>
+        <w:numPr>
+          <w:ilvl w:val="0"/>
+          <w:numId w:val="3"/>
+        </w:numPr>
+      </w:pPr>
+      <w:r>
+        <w:rPr>
+          <w:b/>
+          <w:bCs/>
+        </w:rPr>
+        <w:t>Equipo típico y sueldos mensuales:</w:t>
+      </w:r>
+    </w:p>
+    <w:p>
+      <w:pPr>
+        <w:numPr>
+          <w:ilvl w:val="1"/>
+          <w:numId w:val="3"/>
+        </w:numPr>
+      </w:pPr>
+      <w:r>
+        <w:t>1 Product Manager: USD 6.000</w:t>
+      </w:r>
+    </w:p>
+    <w:p>
+      <w:pPr>
+        <w:numPr>
+          <w:ilvl w:val="1"/>
+          <w:numId w:val="3"/>
+        </w:numPr>
+      </w:pPr>
+      <w:r>
+        <w:t>2-3 Desarrolladores Mobile (iOS/Android): USD 4.000 - 6.000 cada uno</w:t>
+      </w:r>
+    </w:p>
+    <w:p>
+      <w:pPr>
+        <w:numPr>
+          <w:ilvl w:val="1"/>
+          <w:numId w:val="3"/>
+        </w:numPr>
+      </w:pPr>
+      <w:r>
+        <w:t>1 Especialista en IA/Datos: USD 6.000</w:t>
+      </w:r>
+    </w:p>
+    <w:p>
+      <w:pPr>
+        <w:numPr>
+          <w:ilvl w:val="1"/>
+          <w:numId w:val="3"/>
+        </w:numPr>
+      </w:pPr>
+      <w:r>
+        <w:t>1 Backend/API: USD 5.000</w:t>
+      </w:r>
+    </w:p>
+    <w:p>
+      <w:pPr>
+        <w:numPr>
+          <w:ilvl w:val="1"/>
+          <w:numId w:val="3"/>
+        </w:numPr>
+      </w:pPr>
+      <w:r>
+        <w:t>1 QA y soporte: USD 3.000</w:t>
+      </w:r>
+    </w:p>
+    <w:p>
+      <w:pPr>
+        <w:numPr>
+          <w:ilvl w:val="1"/>
+          <w:numId w:val="3"/>
+        </w:numPr>
+      </w:pPr>
+      <w:r>
+        <w:t>1 UX/UI: USD 3.500</w:t>
+      </w:r>
+      <w:hyperlink r:id="rId17" w:tgtFrame="_blank" w:history="1">
+        <w:r>
+          <w:rPr>
+            <w:rStyle w:val="Hipervnculo"/>
+          </w:rPr>
+          <w:t>risingmax</w:t>
+        </w:r>
+      </w:hyperlink>
+    </w:p>
+    <w:p>
+      <w:pPr>
         <w:rPr>
           <w:b/>
           <w:bCs/>
@@ -2060,44 +1673,16 @@
         </w:numPr>
       </w:pPr>
       <w:r>
-        <w:t xml:space="preserve">Desarrollo inicial: USD 80.000 - 180.000 (fuerte en integración con </w:t>
-      </w:r>
-      <w:proofErr w:type="gramStart"/>
-      <w:r>
-        <w:t>wearables</w:t>
-      </w:r>
-      <w:proofErr w:type="gramEnd"/>
-      <w:r>
-        <w:t xml:space="preserve"> y </w:t>
-      </w:r>
-      <w:proofErr w:type="spellStart"/>
-      <w:r>
-        <w:t>backend</w:t>
-      </w:r>
-      <w:proofErr w:type="spellEnd"/>
-      <w:r>
-        <w:t xml:space="preserve"> de analítica).</w:t>
-      </w:r>
-      <w:proofErr w:type="spellStart"/>
-      <w:r>
-        <w:fldChar w:fldCharType="begin"/>
-      </w:r>
-      <w:r>
-        <w:instrText>HYPERLINK "https://risingmax.com/es/blog/how-much-does-it-cost-to-develop-an-ai-app" \t "_blank"</w:instrText>
-      </w:r>
-      <w:r>
-        <w:fldChar w:fldCharType="separate"/>
-      </w:r>
-      <w:r>
-        <w:rPr>
-          <w:rStyle w:val="Hipervnculo"/>
-        </w:rPr>
-        <w:t>risingmax</w:t>
-      </w:r>
-      <w:proofErr w:type="spellEnd"/>
-      <w:r>
-        <w:fldChar w:fldCharType="end"/>
-      </w:r>
+        <w:t>Desarrollo inicial: USD 80.000 - 180.000 (fuerte en integración con wearables y backend de analítica).</w:t>
+      </w:r>
+      <w:hyperlink r:id="rId18" w:tgtFrame="_blank" w:history="1">
+        <w:r>
+          <w:rPr>
+            <w:rStyle w:val="Hipervnculo"/>
+          </w:rPr>
+          <w:t>risingmax</w:t>
+        </w:r>
+      </w:hyperlink>
     </w:p>
     <w:p>
       <w:pPr>
@@ -2145,15 +1730,7 @@
       </w:pPr>
       <w:r>
         <w:lastRenderedPageBreak/>
-        <w:t xml:space="preserve">2 </w:t>
-      </w:r>
-      <w:proofErr w:type="gramStart"/>
-      <w:r>
-        <w:t>Desarrolladores</w:t>
-      </w:r>
-      <w:proofErr w:type="gramEnd"/>
-      <w:r>
-        <w:t xml:space="preserve"> Mobile: USD 4.500 - 5.000 cada uno</w:t>
+        <w:t>2 Desarrolladores Mobile: USD 4.500 - 5.000 cada uno</w:t>
       </w:r>
     </w:p>
     <w:p>
@@ -2164,31 +1741,7 @@
         </w:numPr>
       </w:pPr>
       <w:r>
-        <w:t xml:space="preserve">1 </w:t>
-      </w:r>
-      <w:proofErr w:type="gramStart"/>
-      <w:r>
-        <w:t>Integrador</w:t>
-      </w:r>
-      <w:proofErr w:type="gramEnd"/>
-      <w:r>
-        <w:t xml:space="preserve"> de </w:t>
-      </w:r>
-      <w:proofErr w:type="gramStart"/>
-      <w:r>
-        <w:t>wearables</w:t>
-      </w:r>
-      <w:proofErr w:type="gramEnd"/>
-      <w:r>
-        <w:t>/</w:t>
-      </w:r>
-      <w:proofErr w:type="spellStart"/>
-      <w:r>
-        <w:t>IoT</w:t>
-      </w:r>
-      <w:proofErr w:type="spellEnd"/>
-      <w:r>
-        <w:t>: USD 5.500</w:t>
+        <w:t>1 Integrador de wearables/IoT: USD 5.500</w:t>
       </w:r>
     </w:p>
     <w:p>
@@ -2199,15 +1752,7 @@
         </w:numPr>
       </w:pPr>
       <w:r>
-        <w:t xml:space="preserve">1 </w:t>
-      </w:r>
-      <w:proofErr w:type="spellStart"/>
-      <w:r>
-        <w:t>Backend</w:t>
-      </w:r>
-      <w:proofErr w:type="spellEnd"/>
-      <w:r>
-        <w:t>/API: USD 4.500</w:t>
+        <w:t>1 Backend/API: USD 4.500</w:t>
       </w:r>
     </w:p>
     <w:p>
@@ -2229,17 +1774,9 @@
         </w:numPr>
       </w:pPr>
       <w:r>
-        <w:t xml:space="preserve">1 </w:t>
-      </w:r>
-      <w:proofErr w:type="gramStart"/>
-      <w:r>
-        <w:t>Diseñador</w:t>
-      </w:r>
-      <w:proofErr w:type="gramEnd"/>
-      <w:r>
-        <w:t xml:space="preserve"> UI: USD 3.000</w:t>
-      </w:r>
-      <w:hyperlink r:id="rId17" w:tgtFrame="_blank" w:history="1">
+        <w:t>1 Diseñador UI: USD 3.000</w:t>
+      </w:r>
+      <w:hyperlink r:id="rId19" w:tgtFrame="_blank" w:history="1">
         <w:r>
           <w:rPr>
             <w:rStyle w:val="Hipervnculo"/>
@@ -2255,7 +1792,6 @@
           <w:bCs/>
         </w:rPr>
       </w:pPr>
-      <w:proofErr w:type="spellStart"/>
       <w:r>
         <w:rPr>
           <w:b/>
@@ -2263,7 +1799,6 @@
         </w:rPr>
         <w:t>SwimUp</w:t>
       </w:r>
-      <w:proofErr w:type="spellEnd"/>
     </w:p>
     <w:p>
       <w:pPr>
@@ -2290,26 +1825,14 @@
       <w:r>
         <w:t>Desarrollo inicial: USD 100.000 - 220.000 (incluye personalización avanzada y analítica IA).</w:t>
       </w:r>
-      <w:proofErr w:type="spellStart"/>
-      <w:r>
-        <w:fldChar w:fldCharType="begin"/>
-      </w:r>
-      <w:r>
-        <w:instrText>HYPERLINK "https://risingmax.com/es/blog/how-much-does-it-cost-to-develop-an-ai-app" \t "_blank"</w:instrText>
-      </w:r>
-      <w:r>
-        <w:fldChar w:fldCharType="separate"/>
-      </w:r>
-      <w:r>
-        <w:rPr>
-          <w:rStyle w:val="Hipervnculo"/>
-        </w:rPr>
-        <w:t>risingmax</w:t>
-      </w:r>
-      <w:proofErr w:type="spellEnd"/>
-      <w:r>
-        <w:fldChar w:fldCharType="end"/>
-      </w:r>
+      <w:hyperlink r:id="rId20" w:tgtFrame="_blank" w:history="1">
+        <w:r>
+          <w:rPr>
+            <w:rStyle w:val="Hipervnculo"/>
+          </w:rPr>
+          <w:t>risingmax</w:t>
+        </w:r>
+      </w:hyperlink>
     </w:p>
     <w:p>
       <w:pPr>
@@ -2345,23 +1868,7 @@
         </w:numPr>
       </w:pPr>
       <w:r>
-        <w:t xml:space="preserve">1 </w:t>
-      </w:r>
-      <w:proofErr w:type="spellStart"/>
-      <w:r>
-        <w:t>Product</w:t>
-      </w:r>
-      <w:proofErr w:type="spellEnd"/>
-      <w:r>
-        <w:t xml:space="preserve"> </w:t>
-      </w:r>
-      <w:proofErr w:type="spellStart"/>
-      <w:r>
-        <w:t>Owner</w:t>
-      </w:r>
-      <w:proofErr w:type="spellEnd"/>
-      <w:r>
-        <w:t>: USD 5.000</w:t>
+        <w:t>1 Product Owner: USD 5.000</w:t>
       </w:r>
     </w:p>
     <w:p>
@@ -2372,15 +1879,7 @@
         </w:numPr>
       </w:pPr>
       <w:r>
-        <w:t xml:space="preserve">2 </w:t>
-      </w:r>
-      <w:proofErr w:type="gramStart"/>
-      <w:r>
-        <w:t>Desarrolladores</w:t>
-      </w:r>
-      <w:proofErr w:type="gramEnd"/>
-      <w:r>
-        <w:t xml:space="preserve"> Mobile: USD 4.500 - 5.500 cada uno</w:t>
+        <w:t>2 Desarrolladores Mobile: USD 4.500 - 5.500 cada uno</w:t>
       </w:r>
     </w:p>
     <w:p>
@@ -2391,15 +1890,7 @@
         </w:numPr>
       </w:pPr>
       <w:r>
-        <w:t xml:space="preserve">1 </w:t>
-      </w:r>
-      <w:proofErr w:type="gramStart"/>
-      <w:r>
-        <w:t>Especialista</w:t>
-      </w:r>
-      <w:proofErr w:type="gramEnd"/>
-      <w:r>
-        <w:t xml:space="preserve"> en IA: USD 5.500</w:t>
+        <w:t>1 Especialista en IA: USD 5.500</w:t>
       </w:r>
     </w:p>
     <w:p>
@@ -2410,15 +1901,7 @@
         </w:numPr>
       </w:pPr>
       <w:r>
-        <w:t xml:space="preserve">1 </w:t>
-      </w:r>
-      <w:proofErr w:type="spellStart"/>
-      <w:r>
-        <w:t>Backend</w:t>
-      </w:r>
-      <w:proofErr w:type="spellEnd"/>
-      <w:r>
-        <w:t>/API: USD 4.500</w:t>
+        <w:t>1 Backend/API: USD 4.500</w:t>
       </w:r>
     </w:p>
     <w:p>
@@ -2429,15 +1912,7 @@
         </w:numPr>
       </w:pPr>
       <w:r>
-        <w:t>1 QA/</w:t>
-      </w:r>
-      <w:proofErr w:type="spellStart"/>
-      <w:r>
-        <w:t>Tester</w:t>
-      </w:r>
-      <w:proofErr w:type="spellEnd"/>
-      <w:r>
-        <w:t>: USD 2.800</w:t>
+        <w:t>1 QA/Tester: USD 2.800</w:t>
       </w:r>
     </w:p>
     <w:p>
@@ -2448,17 +1923,9 @@
         </w:numPr>
       </w:pPr>
       <w:r>
-        <w:t xml:space="preserve">1 </w:t>
-      </w:r>
-      <w:proofErr w:type="gramStart"/>
-      <w:r>
-        <w:t>Diseñador</w:t>
-      </w:r>
-      <w:proofErr w:type="gramEnd"/>
-      <w:r>
-        <w:t xml:space="preserve"> UX/UI: USD 3.200</w:t>
-      </w:r>
-      <w:hyperlink r:id="rId18" w:tgtFrame="_blank" w:history="1">
+        <w:t>1 Diseñador UX/UI: USD 3.200</w:t>
+      </w:r>
+      <w:hyperlink r:id="rId21" w:tgtFrame="_blank" w:history="1">
         <w:r>
           <w:rPr>
             <w:rStyle w:val="Hipervnculo"/>
@@ -2469,25 +1936,9 @@
     </w:p>
     <w:p>
       <w:r>
-        <w:t xml:space="preserve">Estos valores varían en función de la ubicación de los equipos, la complejidad funcional de la </w:t>
-      </w:r>
-      <w:proofErr w:type="gramStart"/>
-      <w:r>
-        <w:t>app</w:t>
-      </w:r>
-      <w:proofErr w:type="gramEnd"/>
-      <w:r>
-        <w:t xml:space="preserve">, y si parte del desarrollo se terceriza o usa plataformas preexistentes. Los equipos base son similares en tamaño y perfil para </w:t>
-      </w:r>
-      <w:proofErr w:type="gramStart"/>
-      <w:r>
-        <w:t>apps</w:t>
-      </w:r>
-      <w:proofErr w:type="gramEnd"/>
-      <w:r>
-        <w:t xml:space="preserve"> de este segmento.</w:t>
-      </w:r>
-      <w:hyperlink r:id="rId19" w:tgtFrame="_blank" w:history="1">
+        <w:t>Estos valores varían en función de la ubicación de los equipos, la complejidad funcional de la app, y si parte del desarrollo se terceriza o usa plataformas preexistentes. Los equipos base son similares en tamaño y perfil para apps de este segmento.</w:t>
+      </w:r>
+      <w:hyperlink r:id="rId22" w:tgtFrame="_blank" w:history="1">
         <w:r>
           <w:rPr>
             <w:rStyle w:val="Hipervnculo"/>
@@ -2654,7 +2105,6 @@
                 <w:bCs/>
               </w:rPr>
             </w:pPr>
-            <w:proofErr w:type="spellStart"/>
             <w:r>
               <w:rPr>
                 <w:b/>
@@ -2662,7 +2112,6 @@
               </w:rPr>
               <w:t>Backend</w:t>
             </w:r>
-            <w:proofErr w:type="spellEnd"/>
           </w:p>
         </w:tc>
         <w:tc>
@@ -2721,11 +2170,9 @@
             <w:hideMark/>
           </w:tcPr>
           <w:p>
-            <w:proofErr w:type="spellStart"/>
             <w:r>
               <w:t>MySwimPro</w:t>
             </w:r>
-            <w:proofErr w:type="spellEnd"/>
           </w:p>
         </w:tc>
         <w:tc>
@@ -2925,12 +2372,10 @@
             <w:hideMark/>
           </w:tcPr>
           <w:p>
-            <w:proofErr w:type="spellStart"/>
             <w:r>
               <w:lastRenderedPageBreak/>
               <w:t>SwimUp</w:t>
             </w:r>
-            <w:proofErr w:type="spellEnd"/>
           </w:p>
         </w:tc>
         <w:tc>
@@ -3023,7 +2468,7 @@
       <w:r>
         <w:t>Estos rangos te permiten perfilar costos y márgenes realistas para tu proyecto de referencia y sus equivalentes en el sector.</w:t>
       </w:r>
-      <w:hyperlink r:id="rId20" w:tgtFrame="_blank" w:history="1">
+      <w:hyperlink r:id="rId23" w:tgtFrame="_blank" w:history="1">
         <w:r>
           <w:rPr>
             <w:rStyle w:val="Hipervnculo"/>
@@ -3039,7 +2484,7 @@
           <w:numId w:val="6"/>
         </w:numPr>
       </w:pPr>
-      <w:hyperlink r:id="rId21" w:history="1">
+      <w:hyperlink r:id="rId24" w:history="1">
         <w:r>
           <w:rPr>
             <w:rStyle w:val="Hipervnculo"/>
@@ -3055,7 +2500,7 @@
           <w:numId w:val="6"/>
         </w:numPr>
       </w:pPr>
-      <w:hyperlink r:id="rId22" w:history="1">
+      <w:hyperlink r:id="rId25" w:history="1">
         <w:r>
           <w:rPr>
             <w:rStyle w:val="Hipervnculo"/>
@@ -3071,7 +2516,7 @@
           <w:numId w:val="6"/>
         </w:numPr>
       </w:pPr>
-      <w:hyperlink r:id="rId23" w:history="1">
+      <w:hyperlink r:id="rId26" w:history="1">
         <w:r>
           <w:rPr>
             <w:rStyle w:val="Hipervnculo"/>
@@ -3087,7 +2532,7 @@
           <w:numId w:val="6"/>
         </w:numPr>
       </w:pPr>
-      <w:hyperlink r:id="rId24" w:history="1">
+      <w:hyperlink r:id="rId27" w:history="1">
         <w:r>
           <w:rPr>
             <w:rStyle w:val="Hipervnculo"/>
@@ -3103,7 +2548,7 @@
           <w:numId w:val="6"/>
         </w:numPr>
       </w:pPr>
-      <w:hyperlink r:id="rId25" w:history="1">
+      <w:hyperlink r:id="rId28" w:history="1">
         <w:r>
           <w:rPr>
             <w:rStyle w:val="Hipervnculo"/>
@@ -3119,7 +2564,7 @@
           <w:numId w:val="6"/>
         </w:numPr>
       </w:pPr>
-      <w:hyperlink r:id="rId26" w:history="1">
+      <w:hyperlink r:id="rId29" w:history="1">
         <w:r>
           <w:rPr>
             <w:rStyle w:val="Hipervnculo"/>
@@ -3135,7 +2580,7 @@
           <w:numId w:val="6"/>
         </w:numPr>
       </w:pPr>
-      <w:hyperlink r:id="rId27" w:history="1">
+      <w:hyperlink r:id="rId30" w:history="1">
         <w:r>
           <w:rPr>
             <w:rStyle w:val="Hipervnculo"/>
@@ -3151,7 +2596,7 @@
           <w:numId w:val="6"/>
         </w:numPr>
       </w:pPr>
-      <w:hyperlink r:id="rId28" w:history="1">
+      <w:hyperlink r:id="rId31" w:history="1">
         <w:r>
           <w:rPr>
             <w:rStyle w:val="Hipervnculo"/>
@@ -3167,7 +2612,7 @@
           <w:numId w:val="6"/>
         </w:numPr>
       </w:pPr>
-      <w:hyperlink r:id="rId29" w:history="1">
+      <w:hyperlink r:id="rId32" w:history="1">
         <w:r>
           <w:rPr>
             <w:rStyle w:val="Hipervnculo"/>
@@ -3183,7 +2628,7 @@
           <w:numId w:val="6"/>
         </w:numPr>
       </w:pPr>
-      <w:hyperlink r:id="rId30" w:history="1">
+      <w:hyperlink r:id="rId33" w:history="1">
         <w:r>
           <w:rPr>
             <w:rStyle w:val="Hipervnculo"/>
@@ -3199,7 +2644,7 @@
           <w:numId w:val="6"/>
         </w:numPr>
       </w:pPr>
-      <w:hyperlink r:id="rId31" w:history="1">
+      <w:hyperlink r:id="rId34" w:history="1">
         <w:r>
           <w:rPr>
             <w:rStyle w:val="Hipervnculo"/>
@@ -3215,7 +2660,7 @@
           <w:numId w:val="6"/>
         </w:numPr>
       </w:pPr>
-      <w:hyperlink r:id="rId32" w:history="1">
+      <w:hyperlink r:id="rId35" w:history="1">
         <w:r>
           <w:rPr>
             <w:rStyle w:val="Hipervnculo"/>
@@ -3231,7 +2676,7 @@
           <w:numId w:val="6"/>
         </w:numPr>
       </w:pPr>
-      <w:hyperlink r:id="rId33" w:history="1">
+      <w:hyperlink r:id="rId36" w:history="1">
         <w:r>
           <w:rPr>
             <w:rStyle w:val="Hipervnculo"/>
@@ -3247,7 +2692,7 @@
           <w:numId w:val="6"/>
         </w:numPr>
       </w:pPr>
-      <w:hyperlink r:id="rId34" w:history="1">
+      <w:hyperlink r:id="rId37" w:history="1">
         <w:r>
           <w:rPr>
             <w:rStyle w:val="Hipervnculo"/>
@@ -3263,7 +2708,7 @@
           <w:numId w:val="6"/>
         </w:numPr>
       </w:pPr>
-      <w:hyperlink r:id="rId35" w:history="1">
+      <w:hyperlink r:id="rId38" w:history="1">
         <w:r>
           <w:rPr>
             <w:rStyle w:val="Hipervnculo"/>
@@ -3279,7 +2724,7 @@
           <w:numId w:val="6"/>
         </w:numPr>
       </w:pPr>
-      <w:hyperlink r:id="rId36" w:history="1">
+      <w:hyperlink r:id="rId39" w:history="1">
         <w:r>
           <w:rPr>
             <w:rStyle w:val="Hipervnculo"/>
@@ -3295,7 +2740,7 @@
           <w:numId w:val="6"/>
         </w:numPr>
       </w:pPr>
-      <w:hyperlink r:id="rId37" w:history="1">
+      <w:hyperlink r:id="rId40" w:history="1">
         <w:r>
           <w:rPr>
             <w:rStyle w:val="Hipervnculo"/>
@@ -3311,7 +2756,7 @@
           <w:numId w:val="6"/>
         </w:numPr>
       </w:pPr>
-      <w:hyperlink r:id="rId38" w:history="1">
+      <w:hyperlink r:id="rId41" w:history="1">
         <w:r>
           <w:rPr>
             <w:rStyle w:val="Hipervnculo"/>
@@ -3327,7 +2772,7 @@
           <w:numId w:val="6"/>
         </w:numPr>
       </w:pPr>
-      <w:hyperlink r:id="rId39" w:history="1">
+      <w:hyperlink r:id="rId42" w:history="1">
         <w:r>
           <w:rPr>
             <w:rStyle w:val="Hipervnculo"/>
@@ -3343,7 +2788,7 @@
           <w:numId w:val="6"/>
         </w:numPr>
       </w:pPr>
-      <w:hyperlink r:id="rId40" w:history="1">
+      <w:hyperlink r:id="rId43" w:history="1">
         <w:r>
           <w:rPr>
             <w:rStyle w:val="Hipervnculo"/>
@@ -3359,7 +2804,7 @@
           <w:numId w:val="6"/>
         </w:numPr>
       </w:pPr>
-      <w:hyperlink r:id="rId41" w:history="1">
+      <w:hyperlink r:id="rId44" w:history="1">
         <w:r>
           <w:rPr>
             <w:rStyle w:val="Hipervnculo"/>
@@ -3375,7 +2820,7 @@
           <w:numId w:val="6"/>
         </w:numPr>
       </w:pPr>
-      <w:hyperlink r:id="rId42" w:history="1">
+      <w:hyperlink r:id="rId45" w:history="1">
         <w:r>
           <w:rPr>
             <w:rStyle w:val="Hipervnculo"/>
@@ -3391,7 +2836,7 @@
           <w:numId w:val="6"/>
         </w:numPr>
       </w:pPr>
-      <w:hyperlink r:id="rId43" w:history="1">
+      <w:hyperlink r:id="rId46" w:history="1">
         <w:r>
           <w:rPr>
             <w:rStyle w:val="Hipervnculo"/>
@@ -3407,7 +2852,7 @@
           <w:numId w:val="6"/>
         </w:numPr>
       </w:pPr>
-      <w:hyperlink r:id="rId44" w:history="1">
+      <w:hyperlink r:id="rId47" w:history="1">
         <w:r>
           <w:rPr>
             <w:rStyle w:val="Hipervnculo"/>
@@ -3447,15 +2892,7 @@
     <w:p>
       <w:r>
         <w:lastRenderedPageBreak/>
-        <w:t xml:space="preserve">2. Integrar un modelo de inteligencia artificial en el </w:t>
-      </w:r>
-      <w:proofErr w:type="spellStart"/>
-      <w:r>
-        <w:t>backend</w:t>
-      </w:r>
-      <w:proofErr w:type="spellEnd"/>
-      <w:r>
-        <w:t xml:space="preserve"> para la generación automática de planes de entrenamiento personalizados.</w:t>
+        <w:t>2. Integrar un modelo de inteligencia artificial en el backend para la generación automática de planes de entrenamiento personalizados.</w:t>
       </w:r>
     </w:p>
     <w:p>
@@ -3477,21 +2914,8 @@
       </w:r>
     </w:p>
     <w:p>
-      <w:proofErr w:type="spellStart"/>
-      <w:r>
-        <w:t>Scrumban</w:t>
-      </w:r>
-      <w:proofErr w:type="spellEnd"/>
-      <w:r>
-        <w:t xml:space="preserve">, combinando la estructura iterativa de Scrum con la flexibilidad de Kanban, organizando el trabajo en </w:t>
-      </w:r>
-      <w:proofErr w:type="spellStart"/>
-      <w:r>
-        <w:t>sprints</w:t>
-      </w:r>
-      <w:proofErr w:type="spellEnd"/>
-      <w:r>
-        <w:t xml:space="preserve"> semanales con entregas incrementales.</w:t>
+      <w:r>
+        <w:t>Scrumban, combinando la estructura iterativa de Scrum con la flexibilidad de Kanban, organizando el trabajo en sprints semanales con entregas incrementales.</w:t>
       </w:r>
     </w:p>
     <w:p/>
@@ -3507,15 +2931,7 @@
     </w:p>
     <w:p>
       <w:r>
-        <w:t xml:space="preserve">- Fase 2 (S4-6): Desarrollo </w:t>
-      </w:r>
-      <w:proofErr w:type="spellStart"/>
-      <w:r>
-        <w:t>backend</w:t>
-      </w:r>
-      <w:proofErr w:type="spellEnd"/>
-      <w:r>
-        <w:t xml:space="preserve"> (API, autenticación, base de datos)</w:t>
+        <w:t>- Fase 2 (S4-6): Desarrollo backend (API, autenticación, base de datos)</w:t>
       </w:r>
     </w:p>
     <w:p>
@@ -3525,23 +2941,7 @@
     </w:p>
     <w:p>
       <w:r>
-        <w:t xml:space="preserve">- Fase 4 (S10-12): Desarrollo </w:t>
-      </w:r>
-      <w:proofErr w:type="spellStart"/>
-      <w:r>
-        <w:t>frontend</w:t>
-      </w:r>
-      <w:proofErr w:type="spellEnd"/>
-      <w:r>
-        <w:t xml:space="preserve"> (</w:t>
-      </w:r>
-      <w:proofErr w:type="gramStart"/>
-      <w:r>
-        <w:t>app</w:t>
-      </w:r>
-      <w:proofErr w:type="gramEnd"/>
-      <w:r>
-        <w:t xml:space="preserve"> móvil, visualización)</w:t>
+        <w:t>- Fase 4 (S10-12): Desarrollo frontend (app móvil, visualización)</w:t>
       </w:r>
     </w:p>
     <w:p>
@@ -3556,13 +2956,8 @@
       </w:r>
     </w:p>
     <w:p>
-      <w:proofErr w:type="spellStart"/>
-      <w:r>
-        <w:t>Scrumban</w:t>
-      </w:r>
-      <w:proofErr w:type="spellEnd"/>
-      <w:r>
-        <w:t xml:space="preserve"> permitió adaptarnos rápidamente a desafíos técnicos (integración de IA, problemas de latencia) manteniendo la trazabilidad del avance, priorizando funcionalidades críticas para el MVP y facilitando la coordinación entre roles especializados.</w:t>
+      <w:r>
+        <w:t>Scrumban permitió adaptarnos rápidamente a desafíos técnicos (integración de IA, problemas de latencia) manteniendo la trazabilidad del avance, priorizando funcionalidades críticas para el MVP y facilitando la coordinación entre roles especializados.</w:t>
       </w:r>
     </w:p>
     <w:p/>
@@ -3586,33 +2981,12 @@
     </w:p>
     <w:p>
       <w:r>
-        <w:t xml:space="preserve">2. Prototipado de interfaces en </w:t>
-      </w:r>
-      <w:proofErr w:type="spellStart"/>
-      <w:r>
-        <w:t>Figma</w:t>
-      </w:r>
-      <w:proofErr w:type="spellEnd"/>
-    </w:p>
-    <w:p>
-      <w:r>
-        <w:t xml:space="preserve">3. Desarrollo del </w:t>
-      </w:r>
-      <w:proofErr w:type="spellStart"/>
-      <w:r>
-        <w:t>backend</w:t>
-      </w:r>
-      <w:proofErr w:type="spellEnd"/>
-      <w:r>
-        <w:t xml:space="preserve"> con </w:t>
-      </w:r>
-      <w:proofErr w:type="spellStart"/>
-      <w:r>
-        <w:t>FastAPI</w:t>
-      </w:r>
-      <w:proofErr w:type="spellEnd"/>
-      <w:r>
-        <w:t xml:space="preserve"> y PostgreSQL</w:t>
+        <w:t>2. Prototipado de interfaces en Figma</w:t>
+      </w:r>
+    </w:p>
+    <w:p>
+      <w:r>
+        <w:t>3. Desarrollo del backend con FastAPI y PostgreSQL</w:t>
       </w:r>
     </w:p>
     <w:p>
@@ -3622,36 +2996,12 @@
     </w:p>
     <w:p>
       <w:r>
-        <w:t>5. Integración del modelo de IA (</w:t>
-      </w:r>
-      <w:proofErr w:type="spellStart"/>
-      <w:r>
-        <w:t>Ollama</w:t>
-      </w:r>
-      <w:proofErr w:type="spellEnd"/>
-      <w:r>
-        <w:t>/Gemma3)</w:t>
-      </w:r>
-    </w:p>
-    <w:p>
-      <w:r>
-        <w:t xml:space="preserve">6. Desarrollo de la </w:t>
-      </w:r>
-      <w:proofErr w:type="gramStart"/>
-      <w:r>
-        <w:t>app</w:t>
-      </w:r>
-      <w:proofErr w:type="gramEnd"/>
-      <w:r>
-        <w:t xml:space="preserve"> móvil con </w:t>
-      </w:r>
-      <w:proofErr w:type="spellStart"/>
-      <w:r>
-        <w:t>React</w:t>
-      </w:r>
-      <w:proofErr w:type="spellEnd"/>
-      <w:r>
-        <w:t xml:space="preserve"> Native</w:t>
+        <w:t>5. Integración del modelo de IA (Ollama/Gemma3)</w:t>
+      </w:r>
+    </w:p>
+    <w:p>
+      <w:r>
+        <w:t>6. Desarrollo de la app móvil con React Native</w:t>
       </w:r>
     </w:p>
     <w:p>
@@ -3672,36 +3022,12 @@
     </w:p>
     <w:p>
       <w:r>
-        <w:t xml:space="preserve">- </w:t>
-      </w:r>
-      <w:proofErr w:type="spellStart"/>
-      <w:r>
-        <w:t>Stack</w:t>
-      </w:r>
-      <w:proofErr w:type="spellEnd"/>
-      <w:r>
-        <w:t xml:space="preserve"> tecnológico open-</w:t>
-      </w:r>
-      <w:proofErr w:type="spellStart"/>
-      <w:r>
-        <w:t>source</w:t>
-      </w:r>
-      <w:proofErr w:type="spellEnd"/>
-      <w:r>
-        <w:t xml:space="preserve"> bien documentado</w:t>
-      </w:r>
-    </w:p>
-    <w:p>
-      <w:r>
-        <w:t xml:space="preserve">- Herramientas de colaboración (GitHub, Trello, </w:t>
-      </w:r>
-      <w:proofErr w:type="spellStart"/>
-      <w:r>
-        <w:t>Figma</w:t>
-      </w:r>
-      <w:proofErr w:type="spellEnd"/>
-      <w:r>
-        <w:t>)</w:t>
+        <w:t>- Stack tecnológico open-source bien documentado</w:t>
+      </w:r>
+    </w:p>
+    <w:p>
+      <w:r>
+        <w:t>- Herramientas de colaboración (GitHub, Trello, Figma)</w:t>
       </w:r>
     </w:p>
     <w:p>
@@ -3727,13 +3053,8 @@
     </w:p>
     <w:p>
       <w:r>
-        <w:t xml:space="preserve">- Complejidad en la sincronización </w:t>
-      </w:r>
-      <w:proofErr w:type="spellStart"/>
-      <w:r>
-        <w:t>frontend-backend</w:t>
-      </w:r>
-      <w:proofErr w:type="spellEnd"/>
+        <w:t>- Complejidad en la sincronización frontend-backend</w:t>
+      </w:r>
     </w:p>
     <w:p>
       <w:r>
@@ -3748,15 +3069,7 @@
     </w:p>
     <w:p>
       <w:r>
-        <w:t xml:space="preserve">- Implementación de </w:t>
-      </w:r>
-      <w:proofErr w:type="spellStart"/>
-      <w:r>
-        <w:t>workers</w:t>
-      </w:r>
-      <w:proofErr w:type="spellEnd"/>
-      <w:r>
-        <w:t xml:space="preserve"> asíncronos y Redis para manejar latencia de IA</w:t>
+        <w:t>- Implementación de workers asíncronos y Redis para manejar latencia de IA</w:t>
       </w:r>
     </w:p>
     <w:p>
@@ -3771,15 +3084,7 @@
     </w:p>
     <w:p>
       <w:r>
-        <w:t xml:space="preserve">- Adopción de </w:t>
-      </w:r>
-      <w:proofErr w:type="spellStart"/>
-      <w:r>
-        <w:t>Pydantic</w:t>
-      </w:r>
-      <w:proofErr w:type="spellEnd"/>
-      <w:r>
-        <w:t xml:space="preserve"> para validación robusta de datos</w:t>
+        <w:t>- Adopción de Pydantic para validación robusta de datos</w:t>
       </w:r>
     </w:p>
     <w:p/>
@@ -3827,15 +3132,7 @@
         </w:numPr>
       </w:pPr>
       <w:r>
-        <w:t xml:space="preserve">Prototipos de UI en </w:t>
-      </w:r>
-      <w:proofErr w:type="spellStart"/>
-      <w:r>
-        <w:t>Figma</w:t>
-      </w:r>
-      <w:proofErr w:type="spellEnd"/>
-      <w:r>
-        <w:t xml:space="preserve"> - Valida experiencia de usuario</w:t>
+        <w:t>Prototipos de UI en Figma - Valida experiencia de usuario</w:t>
       </w:r>
     </w:p>
     <w:p>
@@ -3953,13 +3250,8 @@
     </w:p>
     <w:p/>
     <w:p>
-      <w:proofErr w:type="gramStart"/>
-      <w:r>
-        <w:t>Intereses a explorar</w:t>
-      </w:r>
-      <w:proofErr w:type="gramEnd"/>
-      <w:r>
-        <w:t>:</w:t>
+      <w:r>
+        <w:t>Intereses a explorar:</w:t>
       </w:r>
     </w:p>
     <w:p>
@@ -3974,25 +3266,12 @@
     </w:p>
     <w:p>
       <w:r>
-        <w:t xml:space="preserve">- Tecnologías de monitorización y </w:t>
-      </w:r>
-      <w:proofErr w:type="spellStart"/>
-      <w:r>
-        <w:t>observabilidad</w:t>
-      </w:r>
-      <w:proofErr w:type="spellEnd"/>
-    </w:p>
-    <w:p>
-      <w:r>
-        <w:t xml:space="preserve">- Aplicaciones de </w:t>
-      </w:r>
-      <w:proofErr w:type="spellStart"/>
-      <w:r>
-        <w:t>IoT</w:t>
-      </w:r>
-      <w:proofErr w:type="spellEnd"/>
-      <w:r>
-        <w:t xml:space="preserve"> en el ámbito deportivo</w:t>
+        <w:t>- Tecnologías de monitorización y observabilidad</w:t>
+      </w:r>
+    </w:p>
+    <w:p>
+      <w:r>
+        <w:t>- Aplicaciones de IoT en el ámbito deportivo</w:t>
       </w:r>
     </w:p>
     <w:p>
@@ -4023,13 +3302,8 @@
     </w:p>
     <w:p>
       <w:r>
-        <w:t xml:space="preserve">- Gestión de proyectos tecnológicos </w:t>
-      </w:r>
-      <w:proofErr w:type="spellStart"/>
-      <w:r>
-        <w:t>end-to-end</w:t>
-      </w:r>
-      <w:proofErr w:type="spellEnd"/>
+        <w:t>- Gestión de proyectos tecnológicos end-to-end</w:t>
+      </w:r>
     </w:p>
     <w:p>
       <w:r>
@@ -4042,7 +3316,2680 @@
       </w:r>
     </w:p>
     <w:p/>
+    <w:p>
+      <w:pPr>
+        <w:rPr>
+          <w:b/>
+          <w:bCs/>
+        </w:rPr>
+      </w:pPr>
+      <w:r>
+        <w:rPr>
+          <w:b/>
+          <w:bCs/>
+        </w:rPr>
+        <w:t>EVALUACIÓN DE RIESGOS - SMART SWIM</w:t>
+      </w:r>
+    </w:p>
+    <w:p>
+      <w:pPr>
+        <w:rPr>
+          <w:b/>
+          <w:bCs/>
+        </w:rPr>
+      </w:pPr>
+      <w:r>
+        <w:rPr>
+          <w:b/>
+          <w:bCs/>
+        </w:rPr>
+        <w:t>MATRIZ DE IDENTIFICACIÓN Y EVALUACIÓN DE RIESGOS</w:t>
+      </w:r>
+    </w:p>
+    <w:tbl>
+      <w:tblPr>
+        <w:tblW w:w="0" w:type="auto"/>
+        <w:tblCellSpacing w:w="15" w:type="dxa"/>
+        <w:tblBorders>
+          <w:top w:val="single" w:sz="4" w:space="0" w:color="auto"/>
+          <w:left w:val="single" w:sz="4" w:space="0" w:color="auto"/>
+          <w:bottom w:val="single" w:sz="4" w:space="0" w:color="auto"/>
+          <w:right w:val="single" w:sz="4" w:space="0" w:color="auto"/>
+          <w:insideH w:val="single" w:sz="4" w:space="0" w:color="auto"/>
+          <w:insideV w:val="single" w:sz="4" w:space="0" w:color="auto"/>
+        </w:tblBorders>
+        <w:tblCellMar>
+          <w:top w:w="15" w:type="dxa"/>
+          <w:left w:w="15" w:type="dxa"/>
+          <w:bottom w:w="15" w:type="dxa"/>
+          <w:right w:w="15" w:type="dxa"/>
+        </w:tblCellMar>
+        <w:tblLook w:val="04A0" w:firstRow="1" w:lastRow="0" w:firstColumn="1" w:lastColumn="0" w:noHBand="0" w:noVBand="1"/>
+      </w:tblPr>
+      <w:tblGrid>
+        <w:gridCol w:w="1360"/>
+        <w:gridCol w:w="1618"/>
+        <w:gridCol w:w="1241"/>
+        <w:gridCol w:w="838"/>
+        <w:gridCol w:w="689"/>
+        <w:gridCol w:w="1578"/>
+        <w:gridCol w:w="1504"/>
+      </w:tblGrid>
+      <w:tr>
+        <w:trPr>
+          <w:tblHeader/>
+          <w:tblCellSpacing w:w="15" w:type="dxa"/>
+        </w:trPr>
+        <w:tc>
+          <w:tcPr>
+            <w:tcW w:w="0" w:type="auto"/>
+            <w:vAlign w:val="center"/>
+            <w:hideMark/>
+          </w:tcPr>
+          <w:p>
+            <w:pPr>
+              <w:rPr>
+                <w:b/>
+                <w:bCs/>
+                <w:sz w:val="20"/>
+                <w:szCs w:val="20"/>
+              </w:rPr>
+            </w:pPr>
+            <w:r>
+              <w:rPr>
+                <w:b/>
+                <w:bCs/>
+                <w:sz w:val="20"/>
+                <w:szCs w:val="20"/>
+              </w:rPr>
+              <w:lastRenderedPageBreak/>
+              <w:t>Categoría</w:t>
+            </w:r>
+          </w:p>
+        </w:tc>
+        <w:tc>
+          <w:tcPr>
+            <w:tcW w:w="0" w:type="auto"/>
+            <w:vAlign w:val="center"/>
+            <w:hideMark/>
+          </w:tcPr>
+          <w:p>
+            <w:pPr>
+              <w:rPr>
+                <w:b/>
+                <w:bCs/>
+                <w:sz w:val="20"/>
+                <w:szCs w:val="20"/>
+              </w:rPr>
+            </w:pPr>
+            <w:r>
+              <w:rPr>
+                <w:b/>
+                <w:bCs/>
+                <w:sz w:val="20"/>
+                <w:szCs w:val="20"/>
+              </w:rPr>
+              <w:t>Riesgo Identificado</w:t>
+            </w:r>
+          </w:p>
+        </w:tc>
+        <w:tc>
+          <w:tcPr>
+            <w:tcW w:w="0" w:type="auto"/>
+            <w:vAlign w:val="center"/>
+            <w:hideMark/>
+          </w:tcPr>
+          <w:p>
+            <w:pPr>
+              <w:rPr>
+                <w:b/>
+                <w:bCs/>
+                <w:sz w:val="20"/>
+                <w:szCs w:val="20"/>
+              </w:rPr>
+            </w:pPr>
+            <w:r>
+              <w:rPr>
+                <w:b/>
+                <w:bCs/>
+                <w:sz w:val="20"/>
+                <w:szCs w:val="20"/>
+              </w:rPr>
+              <w:t>Probabilidad</w:t>
+            </w:r>
+          </w:p>
+        </w:tc>
+        <w:tc>
+          <w:tcPr>
+            <w:tcW w:w="0" w:type="auto"/>
+            <w:vAlign w:val="center"/>
+            <w:hideMark/>
+          </w:tcPr>
+          <w:p>
+            <w:pPr>
+              <w:rPr>
+                <w:b/>
+                <w:bCs/>
+                <w:sz w:val="20"/>
+                <w:szCs w:val="20"/>
+              </w:rPr>
+            </w:pPr>
+            <w:r>
+              <w:rPr>
+                <w:b/>
+                <w:bCs/>
+                <w:sz w:val="20"/>
+                <w:szCs w:val="20"/>
+              </w:rPr>
+              <w:t>Impacto</w:t>
+            </w:r>
+          </w:p>
+        </w:tc>
+        <w:tc>
+          <w:tcPr>
+            <w:tcW w:w="0" w:type="auto"/>
+            <w:vAlign w:val="center"/>
+            <w:hideMark/>
+          </w:tcPr>
+          <w:p>
+            <w:pPr>
+              <w:rPr>
+                <w:b/>
+                <w:bCs/>
+                <w:sz w:val="20"/>
+                <w:szCs w:val="20"/>
+              </w:rPr>
+            </w:pPr>
+            <w:r>
+              <w:rPr>
+                <w:b/>
+                <w:bCs/>
+                <w:sz w:val="20"/>
+                <w:szCs w:val="20"/>
+              </w:rPr>
+              <w:t>Nivel de Riesgo</w:t>
+            </w:r>
+          </w:p>
+        </w:tc>
+        <w:tc>
+          <w:tcPr>
+            <w:tcW w:w="0" w:type="auto"/>
+            <w:vAlign w:val="center"/>
+            <w:hideMark/>
+          </w:tcPr>
+          <w:p>
+            <w:pPr>
+              <w:rPr>
+                <w:b/>
+                <w:bCs/>
+                <w:sz w:val="20"/>
+                <w:szCs w:val="20"/>
+              </w:rPr>
+            </w:pPr>
+            <w:r>
+              <w:rPr>
+                <w:b/>
+                <w:bCs/>
+                <w:sz w:val="20"/>
+                <w:szCs w:val="20"/>
+              </w:rPr>
+              <w:t>Mitigación</w:t>
+            </w:r>
+          </w:p>
+        </w:tc>
+        <w:tc>
+          <w:tcPr>
+            <w:tcW w:w="0" w:type="auto"/>
+            <w:vAlign w:val="center"/>
+            <w:hideMark/>
+          </w:tcPr>
+          <w:p>
+            <w:pPr>
+              <w:rPr>
+                <w:b/>
+                <w:bCs/>
+                <w:sz w:val="20"/>
+                <w:szCs w:val="20"/>
+              </w:rPr>
+            </w:pPr>
+            <w:r>
+              <w:rPr>
+                <w:b/>
+                <w:bCs/>
+                <w:sz w:val="20"/>
+                <w:szCs w:val="20"/>
+              </w:rPr>
+              <w:t>Ahorro Estimado de Mitigación</w:t>
+            </w:r>
+          </w:p>
+        </w:tc>
+      </w:tr>
+      <w:tr>
+        <w:trPr>
+          <w:tblCellSpacing w:w="15" w:type="dxa"/>
+        </w:trPr>
+        <w:tc>
+          <w:tcPr>
+            <w:tcW w:w="0" w:type="auto"/>
+            <w:vAlign w:val="center"/>
+            <w:hideMark/>
+          </w:tcPr>
+          <w:p>
+            <w:pPr>
+              <w:rPr>
+                <w:sz w:val="20"/>
+                <w:szCs w:val="20"/>
+              </w:rPr>
+            </w:pPr>
+            <w:r>
+              <w:rPr>
+                <w:sz w:val="20"/>
+                <w:szCs w:val="20"/>
+              </w:rPr>
+              <w:t>Técnicos</w:t>
+            </w:r>
+          </w:p>
+        </w:tc>
+        <w:tc>
+          <w:tcPr>
+            <w:tcW w:w="0" w:type="auto"/>
+            <w:vAlign w:val="center"/>
+            <w:hideMark/>
+          </w:tcPr>
+          <w:p>
+            <w:pPr>
+              <w:rPr>
+                <w:sz w:val="20"/>
+                <w:szCs w:val="20"/>
+              </w:rPr>
+            </w:pPr>
+            <w:r>
+              <w:rPr>
+                <w:sz w:val="20"/>
+                <w:szCs w:val="20"/>
+              </w:rPr>
+              <w:t>Latencia en generación de planes por IA</w:t>
+            </w:r>
+          </w:p>
+        </w:tc>
+        <w:tc>
+          <w:tcPr>
+            <w:tcW w:w="0" w:type="auto"/>
+            <w:vAlign w:val="center"/>
+            <w:hideMark/>
+          </w:tcPr>
+          <w:p>
+            <w:pPr>
+              <w:rPr>
+                <w:sz w:val="20"/>
+                <w:szCs w:val="20"/>
+              </w:rPr>
+            </w:pPr>
+            <w:r>
+              <w:rPr>
+                <w:sz w:val="20"/>
+                <w:szCs w:val="20"/>
+              </w:rPr>
+              <w:t>Alta</w:t>
+            </w:r>
+          </w:p>
+        </w:tc>
+        <w:tc>
+          <w:tcPr>
+            <w:tcW w:w="0" w:type="auto"/>
+            <w:vAlign w:val="center"/>
+            <w:hideMark/>
+          </w:tcPr>
+          <w:p>
+            <w:pPr>
+              <w:rPr>
+                <w:sz w:val="20"/>
+                <w:szCs w:val="20"/>
+              </w:rPr>
+            </w:pPr>
+            <w:r>
+              <w:rPr>
+                <w:sz w:val="20"/>
+                <w:szCs w:val="20"/>
+              </w:rPr>
+              <w:t>Medio</w:t>
+            </w:r>
+          </w:p>
+        </w:tc>
+        <w:tc>
+          <w:tcPr>
+            <w:tcW w:w="0" w:type="auto"/>
+            <w:vAlign w:val="center"/>
+            <w:hideMark/>
+          </w:tcPr>
+          <w:p>
+            <w:pPr>
+              <w:rPr>
+                <w:sz w:val="20"/>
+                <w:szCs w:val="20"/>
+              </w:rPr>
+            </w:pPr>
+            <w:r>
+              <w:rPr>
+                <w:sz w:val="20"/>
+                <w:szCs w:val="20"/>
+              </w:rPr>
+              <w:t>Alto</w:t>
+            </w:r>
+          </w:p>
+        </w:tc>
+        <w:tc>
+          <w:tcPr>
+            <w:tcW w:w="0" w:type="auto"/>
+            <w:vAlign w:val="center"/>
+            <w:hideMark/>
+          </w:tcPr>
+          <w:p>
+            <w:pPr>
+              <w:rPr>
+                <w:sz w:val="20"/>
+                <w:szCs w:val="20"/>
+              </w:rPr>
+            </w:pPr>
+            <w:r>
+              <w:rPr>
+                <w:sz w:val="20"/>
+                <w:szCs w:val="20"/>
+              </w:rPr>
+              <w:t>Implementar workers asíncronos, Redis, cache; revisión continua de infraestructura</w:t>
+            </w:r>
+          </w:p>
+        </w:tc>
+        <w:tc>
+          <w:tcPr>
+            <w:tcW w:w="0" w:type="auto"/>
+            <w:vAlign w:val="center"/>
+            <w:hideMark/>
+          </w:tcPr>
+          <w:p>
+            <w:pPr>
+              <w:rPr>
+                <w:sz w:val="20"/>
+                <w:szCs w:val="20"/>
+              </w:rPr>
+            </w:pPr>
+            <w:r>
+              <w:rPr>
+                <w:sz w:val="20"/>
+                <w:szCs w:val="20"/>
+              </w:rPr>
+              <w:t>Evita pérdidas por mal desempeño, aprox. USD 15.000/año (clientes insatisfechos y baja retención)</w:t>
+            </w:r>
+          </w:p>
+        </w:tc>
+      </w:tr>
+      <w:tr>
+        <w:trPr>
+          <w:tblCellSpacing w:w="15" w:type="dxa"/>
+        </w:trPr>
+        <w:tc>
+          <w:tcPr>
+            <w:tcW w:w="0" w:type="auto"/>
+            <w:vAlign w:val="center"/>
+            <w:hideMark/>
+          </w:tcPr>
+          <w:p>
+            <w:pPr>
+              <w:rPr>
+                <w:sz w:val="20"/>
+                <w:szCs w:val="20"/>
+              </w:rPr>
+            </w:pPr>
+            <w:r>
+              <w:rPr>
+                <w:sz w:val="20"/>
+                <w:szCs w:val="20"/>
+              </w:rPr>
+              <w:t>Técnicos</w:t>
+            </w:r>
+          </w:p>
+        </w:tc>
+        <w:tc>
+          <w:tcPr>
+            <w:tcW w:w="0" w:type="auto"/>
+            <w:vAlign w:val="center"/>
+            <w:hideMark/>
+          </w:tcPr>
+          <w:p>
+            <w:pPr>
+              <w:rPr>
+                <w:sz w:val="20"/>
+                <w:szCs w:val="20"/>
+              </w:rPr>
+            </w:pPr>
+            <w:r>
+              <w:rPr>
+                <w:sz w:val="20"/>
+                <w:szCs w:val="20"/>
+              </w:rPr>
+              <w:t>Fallos integración frontend-backend</w:t>
+            </w:r>
+          </w:p>
+        </w:tc>
+        <w:tc>
+          <w:tcPr>
+            <w:tcW w:w="0" w:type="auto"/>
+            <w:vAlign w:val="center"/>
+            <w:hideMark/>
+          </w:tcPr>
+          <w:p>
+            <w:pPr>
+              <w:rPr>
+                <w:sz w:val="20"/>
+                <w:szCs w:val="20"/>
+              </w:rPr>
+            </w:pPr>
+            <w:r>
+              <w:rPr>
+                <w:sz w:val="20"/>
+                <w:szCs w:val="20"/>
+              </w:rPr>
+              <w:t>Media</w:t>
+            </w:r>
+          </w:p>
+        </w:tc>
+        <w:tc>
+          <w:tcPr>
+            <w:tcW w:w="0" w:type="auto"/>
+            <w:vAlign w:val="center"/>
+            <w:hideMark/>
+          </w:tcPr>
+          <w:p>
+            <w:pPr>
+              <w:rPr>
+                <w:sz w:val="20"/>
+                <w:szCs w:val="20"/>
+              </w:rPr>
+            </w:pPr>
+            <w:r>
+              <w:rPr>
+                <w:sz w:val="20"/>
+                <w:szCs w:val="20"/>
+              </w:rPr>
+              <w:t>Alto</w:t>
+            </w:r>
+          </w:p>
+        </w:tc>
+        <w:tc>
+          <w:tcPr>
+            <w:tcW w:w="0" w:type="auto"/>
+            <w:vAlign w:val="center"/>
+            <w:hideMark/>
+          </w:tcPr>
+          <w:p>
+            <w:pPr>
+              <w:rPr>
+                <w:sz w:val="20"/>
+                <w:szCs w:val="20"/>
+              </w:rPr>
+            </w:pPr>
+            <w:r>
+              <w:rPr>
+                <w:sz w:val="20"/>
+                <w:szCs w:val="20"/>
+              </w:rPr>
+              <w:t>Alto</w:t>
+            </w:r>
+          </w:p>
+        </w:tc>
+        <w:tc>
+          <w:tcPr>
+            <w:tcW w:w="0" w:type="auto"/>
+            <w:vAlign w:val="center"/>
+            <w:hideMark/>
+          </w:tcPr>
+          <w:p>
+            <w:pPr>
+              <w:rPr>
+                <w:sz w:val="20"/>
+                <w:szCs w:val="20"/>
+              </w:rPr>
+            </w:pPr>
+            <w:r>
+              <w:rPr>
+                <w:sz w:val="20"/>
+                <w:szCs w:val="20"/>
+              </w:rPr>
+              <w:t>Tests automatizados, versionado API, contratos OpenAPI, deployment incremental</w:t>
+            </w:r>
+          </w:p>
+        </w:tc>
+        <w:tc>
+          <w:tcPr>
+            <w:tcW w:w="0" w:type="auto"/>
+            <w:vAlign w:val="center"/>
+            <w:hideMark/>
+          </w:tcPr>
+          <w:p>
+            <w:pPr>
+              <w:rPr>
+                <w:sz w:val="20"/>
+                <w:szCs w:val="20"/>
+              </w:rPr>
+            </w:pPr>
+            <w:r>
+              <w:rPr>
+                <w:sz w:val="20"/>
+                <w:szCs w:val="20"/>
+              </w:rPr>
+              <w:t>Reduce riesgo de bugs críticos, evita paradas costosas (&gt;USD 10.000/evento)</w:t>
+            </w:r>
+          </w:p>
+        </w:tc>
+      </w:tr>
+      <w:tr>
+        <w:trPr>
+          <w:tblCellSpacing w:w="15" w:type="dxa"/>
+        </w:trPr>
+        <w:tc>
+          <w:tcPr>
+            <w:tcW w:w="0" w:type="auto"/>
+            <w:vAlign w:val="center"/>
+            <w:hideMark/>
+          </w:tcPr>
+          <w:p>
+            <w:pPr>
+              <w:rPr>
+                <w:sz w:val="20"/>
+                <w:szCs w:val="20"/>
+              </w:rPr>
+            </w:pPr>
+            <w:r>
+              <w:rPr>
+                <w:sz w:val="20"/>
+                <w:szCs w:val="20"/>
+              </w:rPr>
+              <w:t>Técnicos</w:t>
+            </w:r>
+          </w:p>
+        </w:tc>
+        <w:tc>
+          <w:tcPr>
+            <w:tcW w:w="0" w:type="auto"/>
+            <w:vAlign w:val="center"/>
+            <w:hideMark/>
+          </w:tcPr>
+          <w:p>
+            <w:pPr>
+              <w:rPr>
+                <w:sz w:val="20"/>
+                <w:szCs w:val="20"/>
+              </w:rPr>
+            </w:pPr>
+            <w:r>
+              <w:rPr>
+                <w:sz w:val="20"/>
+                <w:szCs w:val="20"/>
+              </w:rPr>
+              <w:t>Problemas rendimiento base de datos</w:t>
+            </w:r>
+          </w:p>
+        </w:tc>
+        <w:tc>
+          <w:tcPr>
+            <w:tcW w:w="0" w:type="auto"/>
+            <w:vAlign w:val="center"/>
+            <w:hideMark/>
+          </w:tcPr>
+          <w:p>
+            <w:pPr>
+              <w:rPr>
+                <w:sz w:val="20"/>
+                <w:szCs w:val="20"/>
+              </w:rPr>
+            </w:pPr>
+            <w:r>
+              <w:rPr>
+                <w:sz w:val="20"/>
+                <w:szCs w:val="20"/>
+              </w:rPr>
+              <w:t>Media</w:t>
+            </w:r>
+          </w:p>
+        </w:tc>
+        <w:tc>
+          <w:tcPr>
+            <w:tcW w:w="0" w:type="auto"/>
+            <w:vAlign w:val="center"/>
+            <w:hideMark/>
+          </w:tcPr>
+          <w:p>
+            <w:pPr>
+              <w:rPr>
+                <w:sz w:val="20"/>
+                <w:szCs w:val="20"/>
+              </w:rPr>
+            </w:pPr>
+            <w:r>
+              <w:rPr>
+                <w:sz w:val="20"/>
+                <w:szCs w:val="20"/>
+              </w:rPr>
+              <w:t>Alto</w:t>
+            </w:r>
+          </w:p>
+        </w:tc>
+        <w:tc>
+          <w:tcPr>
+            <w:tcW w:w="0" w:type="auto"/>
+            <w:vAlign w:val="center"/>
+            <w:hideMark/>
+          </w:tcPr>
+          <w:p>
+            <w:pPr>
+              <w:rPr>
+                <w:sz w:val="20"/>
+                <w:szCs w:val="20"/>
+              </w:rPr>
+            </w:pPr>
+            <w:r>
+              <w:rPr>
+                <w:sz w:val="20"/>
+                <w:szCs w:val="20"/>
+              </w:rPr>
+              <w:t>Alto</w:t>
+            </w:r>
+          </w:p>
+        </w:tc>
+        <w:tc>
+          <w:tcPr>
+            <w:tcW w:w="0" w:type="auto"/>
+            <w:vAlign w:val="center"/>
+            <w:hideMark/>
+          </w:tcPr>
+          <w:p>
+            <w:pPr>
+              <w:rPr>
+                <w:sz w:val="20"/>
+                <w:szCs w:val="20"/>
+              </w:rPr>
+            </w:pPr>
+            <w:r>
+              <w:rPr>
+                <w:sz w:val="20"/>
+                <w:szCs w:val="20"/>
+              </w:rPr>
+              <w:t>Indexado, optimización queries, monitoreo 24/7</w:t>
+            </w:r>
+          </w:p>
+        </w:tc>
+        <w:tc>
+          <w:tcPr>
+            <w:tcW w:w="0" w:type="auto"/>
+            <w:vAlign w:val="center"/>
+            <w:hideMark/>
+          </w:tcPr>
+          <w:p>
+            <w:pPr>
+              <w:rPr>
+                <w:sz w:val="20"/>
+                <w:szCs w:val="20"/>
+              </w:rPr>
+            </w:pPr>
+            <w:r>
+              <w:rPr>
+                <w:sz w:val="20"/>
+                <w:szCs w:val="20"/>
+              </w:rPr>
+              <w:t>Previene caídas, ahorra soporte de emergencia (USD 8.000/año)</w:t>
+            </w:r>
+          </w:p>
+        </w:tc>
+      </w:tr>
+      <w:tr>
+        <w:trPr>
+          <w:tblCellSpacing w:w="15" w:type="dxa"/>
+        </w:trPr>
+        <w:tc>
+          <w:tcPr>
+            <w:tcW w:w="0" w:type="auto"/>
+            <w:vAlign w:val="center"/>
+            <w:hideMark/>
+          </w:tcPr>
+          <w:p>
+            <w:pPr>
+              <w:rPr>
+                <w:sz w:val="20"/>
+                <w:szCs w:val="20"/>
+              </w:rPr>
+            </w:pPr>
+            <w:r>
+              <w:rPr>
+                <w:sz w:val="20"/>
+                <w:szCs w:val="20"/>
+              </w:rPr>
+              <w:t>Operacionales</w:t>
+            </w:r>
+          </w:p>
+        </w:tc>
+        <w:tc>
+          <w:tcPr>
+            <w:tcW w:w="0" w:type="auto"/>
+            <w:vAlign w:val="center"/>
+            <w:hideMark/>
+          </w:tcPr>
+          <w:p>
+            <w:pPr>
+              <w:rPr>
+                <w:sz w:val="20"/>
+                <w:szCs w:val="20"/>
+              </w:rPr>
+            </w:pPr>
+            <w:r>
+              <w:rPr>
+                <w:sz w:val="20"/>
+                <w:szCs w:val="20"/>
+              </w:rPr>
+              <w:t>Falta de disponibilidad del equipo</w:t>
+            </w:r>
+          </w:p>
+        </w:tc>
+        <w:tc>
+          <w:tcPr>
+            <w:tcW w:w="0" w:type="auto"/>
+            <w:vAlign w:val="center"/>
+            <w:hideMark/>
+          </w:tcPr>
+          <w:p>
+            <w:pPr>
+              <w:rPr>
+                <w:sz w:val="20"/>
+                <w:szCs w:val="20"/>
+              </w:rPr>
+            </w:pPr>
+            <w:r>
+              <w:rPr>
+                <w:sz w:val="20"/>
+                <w:szCs w:val="20"/>
+              </w:rPr>
+              <w:t>Baja</w:t>
+            </w:r>
+          </w:p>
+        </w:tc>
+        <w:tc>
+          <w:tcPr>
+            <w:tcW w:w="0" w:type="auto"/>
+            <w:vAlign w:val="center"/>
+            <w:hideMark/>
+          </w:tcPr>
+          <w:p>
+            <w:pPr>
+              <w:rPr>
+                <w:sz w:val="20"/>
+                <w:szCs w:val="20"/>
+              </w:rPr>
+            </w:pPr>
+            <w:r>
+              <w:rPr>
+                <w:sz w:val="20"/>
+                <w:szCs w:val="20"/>
+              </w:rPr>
+              <w:t>Alto</w:t>
+            </w:r>
+          </w:p>
+        </w:tc>
+        <w:tc>
+          <w:tcPr>
+            <w:tcW w:w="0" w:type="auto"/>
+            <w:vAlign w:val="center"/>
+            <w:hideMark/>
+          </w:tcPr>
+          <w:p>
+            <w:pPr>
+              <w:rPr>
+                <w:sz w:val="20"/>
+                <w:szCs w:val="20"/>
+              </w:rPr>
+            </w:pPr>
+            <w:r>
+              <w:rPr>
+                <w:sz w:val="20"/>
+                <w:szCs w:val="20"/>
+              </w:rPr>
+              <w:t>Medio</w:t>
+            </w:r>
+          </w:p>
+        </w:tc>
+        <w:tc>
+          <w:tcPr>
+            <w:tcW w:w="0" w:type="auto"/>
+            <w:vAlign w:val="center"/>
+            <w:hideMark/>
+          </w:tcPr>
+          <w:p>
+            <w:pPr>
+              <w:rPr>
+                <w:sz w:val="20"/>
+                <w:szCs w:val="20"/>
+              </w:rPr>
+            </w:pPr>
+            <w:r>
+              <w:rPr>
+                <w:sz w:val="20"/>
+                <w:szCs w:val="20"/>
+              </w:rPr>
+              <w:t>Documentación exhaustiva, pair programming, respaldo de tareas</w:t>
+            </w:r>
+          </w:p>
+        </w:tc>
+        <w:tc>
+          <w:tcPr>
+            <w:tcW w:w="0" w:type="auto"/>
+            <w:vAlign w:val="center"/>
+            <w:hideMark/>
+          </w:tcPr>
+          <w:p>
+            <w:pPr>
+              <w:rPr>
+                <w:sz w:val="20"/>
+                <w:szCs w:val="20"/>
+              </w:rPr>
+            </w:pPr>
+            <w:r>
+              <w:rPr>
+                <w:sz w:val="20"/>
+                <w:szCs w:val="20"/>
+              </w:rPr>
+              <w:t>Evita retrasos, reduce sobrecostos de horas extra (USD 3.000/proyecto)</w:t>
+            </w:r>
+          </w:p>
+        </w:tc>
+      </w:tr>
+      <w:tr>
+        <w:trPr>
+          <w:tblCellSpacing w:w="15" w:type="dxa"/>
+        </w:trPr>
+        <w:tc>
+          <w:tcPr>
+            <w:tcW w:w="0" w:type="auto"/>
+            <w:vAlign w:val="center"/>
+            <w:hideMark/>
+          </w:tcPr>
+          <w:p>
+            <w:pPr>
+              <w:rPr>
+                <w:sz w:val="20"/>
+                <w:szCs w:val="20"/>
+              </w:rPr>
+            </w:pPr>
+            <w:r>
+              <w:rPr>
+                <w:sz w:val="20"/>
+                <w:szCs w:val="20"/>
+              </w:rPr>
+              <w:t>Operacionales</w:t>
+            </w:r>
+          </w:p>
+        </w:tc>
+        <w:tc>
+          <w:tcPr>
+            <w:tcW w:w="0" w:type="auto"/>
+            <w:vAlign w:val="center"/>
+            <w:hideMark/>
+          </w:tcPr>
+          <w:p>
+            <w:pPr>
+              <w:rPr>
+                <w:sz w:val="20"/>
+                <w:szCs w:val="20"/>
+              </w:rPr>
+            </w:pPr>
+            <w:r>
+              <w:rPr>
+                <w:sz w:val="20"/>
+                <w:szCs w:val="20"/>
+              </w:rPr>
+              <w:t>Incumplimiento de plazos</w:t>
+            </w:r>
+          </w:p>
+        </w:tc>
+        <w:tc>
+          <w:tcPr>
+            <w:tcW w:w="0" w:type="auto"/>
+            <w:vAlign w:val="center"/>
+            <w:hideMark/>
+          </w:tcPr>
+          <w:p>
+            <w:pPr>
+              <w:rPr>
+                <w:sz w:val="20"/>
+                <w:szCs w:val="20"/>
+              </w:rPr>
+            </w:pPr>
+            <w:r>
+              <w:rPr>
+                <w:sz w:val="20"/>
+                <w:szCs w:val="20"/>
+              </w:rPr>
+              <w:t>Media</w:t>
+            </w:r>
+          </w:p>
+        </w:tc>
+        <w:tc>
+          <w:tcPr>
+            <w:tcW w:w="0" w:type="auto"/>
+            <w:vAlign w:val="center"/>
+            <w:hideMark/>
+          </w:tcPr>
+          <w:p>
+            <w:pPr>
+              <w:rPr>
+                <w:sz w:val="20"/>
+                <w:szCs w:val="20"/>
+              </w:rPr>
+            </w:pPr>
+            <w:r>
+              <w:rPr>
+                <w:sz w:val="20"/>
+                <w:szCs w:val="20"/>
+              </w:rPr>
+              <w:t>Alto</w:t>
+            </w:r>
+          </w:p>
+        </w:tc>
+        <w:tc>
+          <w:tcPr>
+            <w:tcW w:w="0" w:type="auto"/>
+            <w:vAlign w:val="center"/>
+            <w:hideMark/>
+          </w:tcPr>
+          <w:p>
+            <w:pPr>
+              <w:rPr>
+                <w:sz w:val="20"/>
+                <w:szCs w:val="20"/>
+              </w:rPr>
+            </w:pPr>
+            <w:r>
+              <w:rPr>
+                <w:sz w:val="20"/>
+                <w:szCs w:val="20"/>
+              </w:rPr>
+              <w:t>Alto</w:t>
+            </w:r>
+          </w:p>
+        </w:tc>
+        <w:tc>
+          <w:tcPr>
+            <w:tcW w:w="0" w:type="auto"/>
+            <w:vAlign w:val="center"/>
+            <w:hideMark/>
+          </w:tcPr>
+          <w:p>
+            <w:pPr>
+              <w:rPr>
+                <w:sz w:val="20"/>
+                <w:szCs w:val="20"/>
+              </w:rPr>
+            </w:pPr>
+            <w:r>
+              <w:rPr>
+                <w:sz w:val="20"/>
+                <w:szCs w:val="20"/>
+              </w:rPr>
+              <w:t>Scrumban, revisión semanal, ajuste de prioridades</w:t>
+            </w:r>
+          </w:p>
+        </w:tc>
+        <w:tc>
+          <w:tcPr>
+            <w:tcW w:w="0" w:type="auto"/>
+            <w:vAlign w:val="center"/>
+            <w:hideMark/>
+          </w:tcPr>
+          <w:p>
+            <w:pPr>
+              <w:rPr>
+                <w:sz w:val="20"/>
+                <w:szCs w:val="20"/>
+              </w:rPr>
+            </w:pPr>
+            <w:r>
+              <w:rPr>
+                <w:sz w:val="20"/>
+                <w:szCs w:val="20"/>
+              </w:rPr>
+              <w:t>Minimiza gastos asociados a retrasos (USD 5.000/proyecto)</w:t>
+            </w:r>
+          </w:p>
+        </w:tc>
+      </w:tr>
+      <w:tr>
+        <w:trPr>
+          <w:tblCellSpacing w:w="15" w:type="dxa"/>
+        </w:trPr>
+        <w:tc>
+          <w:tcPr>
+            <w:tcW w:w="0" w:type="auto"/>
+            <w:vAlign w:val="center"/>
+            <w:hideMark/>
+          </w:tcPr>
+          <w:p>
+            <w:pPr>
+              <w:rPr>
+                <w:sz w:val="20"/>
+                <w:szCs w:val="20"/>
+              </w:rPr>
+            </w:pPr>
+            <w:r>
+              <w:rPr>
+                <w:sz w:val="20"/>
+                <w:szCs w:val="20"/>
+              </w:rPr>
+              <w:t>Económicos</w:t>
+            </w:r>
+          </w:p>
+        </w:tc>
+        <w:tc>
+          <w:tcPr>
+            <w:tcW w:w="0" w:type="auto"/>
+            <w:vAlign w:val="center"/>
+            <w:hideMark/>
+          </w:tcPr>
+          <w:p>
+            <w:pPr>
+              <w:rPr>
+                <w:sz w:val="20"/>
+                <w:szCs w:val="20"/>
+              </w:rPr>
+            </w:pPr>
+            <w:r>
+              <w:rPr>
+                <w:sz w:val="20"/>
+                <w:szCs w:val="20"/>
+              </w:rPr>
+              <w:t>Exceso de costos operativos</w:t>
+            </w:r>
+          </w:p>
+        </w:tc>
+        <w:tc>
+          <w:tcPr>
+            <w:tcW w:w="0" w:type="auto"/>
+            <w:vAlign w:val="center"/>
+            <w:hideMark/>
+          </w:tcPr>
+          <w:p>
+            <w:pPr>
+              <w:rPr>
+                <w:sz w:val="20"/>
+                <w:szCs w:val="20"/>
+              </w:rPr>
+            </w:pPr>
+            <w:r>
+              <w:rPr>
+                <w:sz w:val="20"/>
+                <w:szCs w:val="20"/>
+              </w:rPr>
+              <w:t>Baja</w:t>
+            </w:r>
+          </w:p>
+        </w:tc>
+        <w:tc>
+          <w:tcPr>
+            <w:tcW w:w="0" w:type="auto"/>
+            <w:vAlign w:val="center"/>
+            <w:hideMark/>
+          </w:tcPr>
+          <w:p>
+            <w:pPr>
+              <w:rPr>
+                <w:sz w:val="20"/>
+                <w:szCs w:val="20"/>
+              </w:rPr>
+            </w:pPr>
+            <w:r>
+              <w:rPr>
+                <w:sz w:val="20"/>
+                <w:szCs w:val="20"/>
+              </w:rPr>
+              <w:t>Medio</w:t>
+            </w:r>
+          </w:p>
+        </w:tc>
+        <w:tc>
+          <w:tcPr>
+            <w:tcW w:w="0" w:type="auto"/>
+            <w:vAlign w:val="center"/>
+            <w:hideMark/>
+          </w:tcPr>
+          <w:p>
+            <w:pPr>
+              <w:rPr>
+                <w:sz w:val="20"/>
+                <w:szCs w:val="20"/>
+              </w:rPr>
+            </w:pPr>
+            <w:r>
+              <w:rPr>
+                <w:sz w:val="20"/>
+                <w:szCs w:val="20"/>
+              </w:rPr>
+              <w:t>Bajo</w:t>
+            </w:r>
+          </w:p>
+        </w:tc>
+        <w:tc>
+          <w:tcPr>
+            <w:tcW w:w="0" w:type="auto"/>
+            <w:vAlign w:val="center"/>
+            <w:hideMark/>
+          </w:tcPr>
+          <w:p>
+            <w:pPr>
+              <w:rPr>
+                <w:sz w:val="20"/>
+                <w:szCs w:val="20"/>
+              </w:rPr>
+            </w:pPr>
+            <w:r>
+              <w:rPr>
+                <w:sz w:val="20"/>
+                <w:szCs w:val="20"/>
+              </w:rPr>
+              <w:t xml:space="preserve">Control mensual, recursos eficientes, </w:t>
+            </w:r>
+            <w:r>
+              <w:rPr>
+                <w:sz w:val="20"/>
+                <w:szCs w:val="20"/>
+              </w:rPr>
+              <w:lastRenderedPageBreak/>
+              <w:t>presupuesto contingente</w:t>
+            </w:r>
+          </w:p>
+        </w:tc>
+        <w:tc>
+          <w:tcPr>
+            <w:tcW w:w="0" w:type="auto"/>
+            <w:vAlign w:val="center"/>
+            <w:hideMark/>
+          </w:tcPr>
+          <w:p>
+            <w:pPr>
+              <w:rPr>
+                <w:sz w:val="20"/>
+                <w:szCs w:val="20"/>
+              </w:rPr>
+            </w:pPr>
+            <w:r>
+              <w:rPr>
+                <w:sz w:val="20"/>
+                <w:szCs w:val="20"/>
+              </w:rPr>
+              <w:lastRenderedPageBreak/>
+              <w:t>Ahorro presupuestario de al menos 10–15% anual (USD 1.500/año)</w:t>
+            </w:r>
+          </w:p>
+        </w:tc>
+      </w:tr>
+      <w:tr>
+        <w:trPr>
+          <w:tblCellSpacing w:w="15" w:type="dxa"/>
+        </w:trPr>
+        <w:tc>
+          <w:tcPr>
+            <w:tcW w:w="0" w:type="auto"/>
+            <w:vAlign w:val="center"/>
+            <w:hideMark/>
+          </w:tcPr>
+          <w:p>
+            <w:pPr>
+              <w:rPr>
+                <w:sz w:val="20"/>
+                <w:szCs w:val="20"/>
+              </w:rPr>
+            </w:pPr>
+            <w:r>
+              <w:rPr>
+                <w:sz w:val="20"/>
+                <w:szCs w:val="20"/>
+              </w:rPr>
+              <w:t>Mercado</w:t>
+            </w:r>
+          </w:p>
+        </w:tc>
+        <w:tc>
+          <w:tcPr>
+            <w:tcW w:w="0" w:type="auto"/>
+            <w:vAlign w:val="center"/>
+            <w:hideMark/>
+          </w:tcPr>
+          <w:p>
+            <w:pPr>
+              <w:rPr>
+                <w:sz w:val="20"/>
+                <w:szCs w:val="20"/>
+              </w:rPr>
+            </w:pPr>
+            <w:r>
+              <w:rPr>
+                <w:sz w:val="20"/>
+                <w:szCs w:val="20"/>
+              </w:rPr>
+              <w:t>Baja adopción por usuarios</w:t>
+            </w:r>
+          </w:p>
+        </w:tc>
+        <w:tc>
+          <w:tcPr>
+            <w:tcW w:w="0" w:type="auto"/>
+            <w:vAlign w:val="center"/>
+            <w:hideMark/>
+          </w:tcPr>
+          <w:p>
+            <w:pPr>
+              <w:rPr>
+                <w:sz w:val="20"/>
+                <w:szCs w:val="20"/>
+              </w:rPr>
+            </w:pPr>
+            <w:r>
+              <w:rPr>
+                <w:sz w:val="20"/>
+                <w:szCs w:val="20"/>
+              </w:rPr>
+              <w:t>Media</w:t>
+            </w:r>
+          </w:p>
+        </w:tc>
+        <w:tc>
+          <w:tcPr>
+            <w:tcW w:w="0" w:type="auto"/>
+            <w:vAlign w:val="center"/>
+            <w:hideMark/>
+          </w:tcPr>
+          <w:p>
+            <w:pPr>
+              <w:rPr>
+                <w:sz w:val="20"/>
+                <w:szCs w:val="20"/>
+              </w:rPr>
+            </w:pPr>
+            <w:r>
+              <w:rPr>
+                <w:sz w:val="20"/>
+                <w:szCs w:val="20"/>
+              </w:rPr>
+              <w:t>Alto</w:t>
+            </w:r>
+          </w:p>
+        </w:tc>
+        <w:tc>
+          <w:tcPr>
+            <w:tcW w:w="0" w:type="auto"/>
+            <w:vAlign w:val="center"/>
+            <w:hideMark/>
+          </w:tcPr>
+          <w:p>
+            <w:pPr>
+              <w:rPr>
+                <w:sz w:val="20"/>
+                <w:szCs w:val="20"/>
+              </w:rPr>
+            </w:pPr>
+            <w:r>
+              <w:rPr>
+                <w:sz w:val="20"/>
+                <w:szCs w:val="20"/>
+              </w:rPr>
+              <w:t>Alto</w:t>
+            </w:r>
+          </w:p>
+        </w:tc>
+        <w:tc>
+          <w:tcPr>
+            <w:tcW w:w="0" w:type="auto"/>
+            <w:vAlign w:val="center"/>
+            <w:hideMark/>
+          </w:tcPr>
+          <w:p>
+            <w:pPr>
+              <w:rPr>
+                <w:sz w:val="20"/>
+                <w:szCs w:val="20"/>
+              </w:rPr>
+            </w:pPr>
+            <w:r>
+              <w:rPr>
+                <w:sz w:val="20"/>
+                <w:szCs w:val="20"/>
+              </w:rPr>
+              <w:t>Validación temprana, beta testers, encuestas iterativas</w:t>
+            </w:r>
+          </w:p>
+        </w:tc>
+        <w:tc>
+          <w:tcPr>
+            <w:tcW w:w="0" w:type="auto"/>
+            <w:vAlign w:val="center"/>
+            <w:hideMark/>
+          </w:tcPr>
+          <w:p>
+            <w:pPr>
+              <w:rPr>
+                <w:sz w:val="20"/>
+                <w:szCs w:val="20"/>
+              </w:rPr>
+            </w:pPr>
+            <w:r>
+              <w:rPr>
+                <w:sz w:val="20"/>
+                <w:szCs w:val="20"/>
+              </w:rPr>
+              <w:t>Disminuye riesgo de lanzamiento fallido, ahorra inversión perdida (USD 8.000)</w:t>
+            </w:r>
+          </w:p>
+        </w:tc>
+      </w:tr>
+      <w:tr>
+        <w:trPr>
+          <w:tblCellSpacing w:w="15" w:type="dxa"/>
+        </w:trPr>
+        <w:tc>
+          <w:tcPr>
+            <w:tcW w:w="0" w:type="auto"/>
+            <w:vAlign w:val="center"/>
+            <w:hideMark/>
+          </w:tcPr>
+          <w:p>
+            <w:pPr>
+              <w:rPr>
+                <w:sz w:val="20"/>
+                <w:szCs w:val="20"/>
+              </w:rPr>
+            </w:pPr>
+            <w:r>
+              <w:rPr>
+                <w:sz w:val="20"/>
+                <w:szCs w:val="20"/>
+              </w:rPr>
+              <w:t>Mercado</w:t>
+            </w:r>
+          </w:p>
+        </w:tc>
+        <w:tc>
+          <w:tcPr>
+            <w:tcW w:w="0" w:type="auto"/>
+            <w:vAlign w:val="center"/>
+            <w:hideMark/>
+          </w:tcPr>
+          <w:p>
+            <w:pPr>
+              <w:rPr>
+                <w:sz w:val="20"/>
+                <w:szCs w:val="20"/>
+              </w:rPr>
+            </w:pPr>
+            <w:r>
+              <w:rPr>
+                <w:sz w:val="20"/>
+                <w:szCs w:val="20"/>
+              </w:rPr>
+              <w:t>Competencia agresiva</w:t>
+            </w:r>
+          </w:p>
+        </w:tc>
+        <w:tc>
+          <w:tcPr>
+            <w:tcW w:w="0" w:type="auto"/>
+            <w:vAlign w:val="center"/>
+            <w:hideMark/>
+          </w:tcPr>
+          <w:p>
+            <w:pPr>
+              <w:rPr>
+                <w:sz w:val="20"/>
+                <w:szCs w:val="20"/>
+              </w:rPr>
+            </w:pPr>
+            <w:r>
+              <w:rPr>
+                <w:sz w:val="20"/>
+                <w:szCs w:val="20"/>
+              </w:rPr>
+              <w:t>Media</w:t>
+            </w:r>
+          </w:p>
+        </w:tc>
+        <w:tc>
+          <w:tcPr>
+            <w:tcW w:w="0" w:type="auto"/>
+            <w:vAlign w:val="center"/>
+            <w:hideMark/>
+          </w:tcPr>
+          <w:p>
+            <w:pPr>
+              <w:rPr>
+                <w:sz w:val="20"/>
+                <w:szCs w:val="20"/>
+              </w:rPr>
+            </w:pPr>
+            <w:r>
+              <w:rPr>
+                <w:sz w:val="20"/>
+                <w:szCs w:val="20"/>
+              </w:rPr>
+              <w:t>Medio</w:t>
+            </w:r>
+          </w:p>
+        </w:tc>
+        <w:tc>
+          <w:tcPr>
+            <w:tcW w:w="0" w:type="auto"/>
+            <w:vAlign w:val="center"/>
+            <w:hideMark/>
+          </w:tcPr>
+          <w:p>
+            <w:pPr>
+              <w:rPr>
+                <w:sz w:val="20"/>
+                <w:szCs w:val="20"/>
+              </w:rPr>
+            </w:pPr>
+            <w:r>
+              <w:rPr>
+                <w:sz w:val="20"/>
+                <w:szCs w:val="20"/>
+              </w:rPr>
+              <w:t>Medio</w:t>
+            </w:r>
+          </w:p>
+        </w:tc>
+        <w:tc>
+          <w:tcPr>
+            <w:tcW w:w="0" w:type="auto"/>
+            <w:vAlign w:val="center"/>
+            <w:hideMark/>
+          </w:tcPr>
+          <w:p>
+            <w:pPr>
+              <w:rPr>
+                <w:sz w:val="20"/>
+                <w:szCs w:val="20"/>
+              </w:rPr>
+            </w:pPr>
+            <w:r>
+              <w:rPr>
+                <w:sz w:val="20"/>
+                <w:szCs w:val="20"/>
+              </w:rPr>
+              <w:t>Diferenciación nicho, seguridad, precios competitivos</w:t>
+            </w:r>
+          </w:p>
+        </w:tc>
+        <w:tc>
+          <w:tcPr>
+            <w:tcW w:w="0" w:type="auto"/>
+            <w:vAlign w:val="center"/>
+            <w:hideMark/>
+          </w:tcPr>
+          <w:p>
+            <w:pPr>
+              <w:rPr>
+                <w:sz w:val="20"/>
+                <w:szCs w:val="20"/>
+              </w:rPr>
+            </w:pPr>
+            <w:r>
+              <w:rPr>
+                <w:sz w:val="20"/>
+                <w:szCs w:val="20"/>
+              </w:rPr>
+              <w:t>Mejora retención y ventas, difícil de cuantificar</w:t>
+            </w:r>
+          </w:p>
+        </w:tc>
+      </w:tr>
+      <w:tr>
+        <w:trPr>
+          <w:tblCellSpacing w:w="15" w:type="dxa"/>
+        </w:trPr>
+        <w:tc>
+          <w:tcPr>
+            <w:tcW w:w="0" w:type="auto"/>
+            <w:vAlign w:val="center"/>
+            <w:hideMark/>
+          </w:tcPr>
+          <w:p>
+            <w:pPr>
+              <w:rPr>
+                <w:sz w:val="20"/>
+                <w:szCs w:val="20"/>
+              </w:rPr>
+            </w:pPr>
+            <w:r>
+              <w:rPr>
+                <w:sz w:val="20"/>
+                <w:szCs w:val="20"/>
+              </w:rPr>
+              <w:t>Legal</w:t>
+            </w:r>
+          </w:p>
+        </w:tc>
+        <w:tc>
+          <w:tcPr>
+            <w:tcW w:w="0" w:type="auto"/>
+            <w:vAlign w:val="center"/>
+            <w:hideMark/>
+          </w:tcPr>
+          <w:p>
+            <w:pPr>
+              <w:rPr>
+                <w:sz w:val="20"/>
+                <w:szCs w:val="20"/>
+              </w:rPr>
+            </w:pPr>
+            <w:r>
+              <w:rPr>
+                <w:sz w:val="20"/>
+                <w:szCs w:val="20"/>
+              </w:rPr>
+              <w:t>Problemas de protección de datos/regulación</w:t>
+            </w:r>
+          </w:p>
+        </w:tc>
+        <w:tc>
+          <w:tcPr>
+            <w:tcW w:w="0" w:type="auto"/>
+            <w:vAlign w:val="center"/>
+            <w:hideMark/>
+          </w:tcPr>
+          <w:p>
+            <w:pPr>
+              <w:rPr>
+                <w:sz w:val="20"/>
+                <w:szCs w:val="20"/>
+              </w:rPr>
+            </w:pPr>
+            <w:r>
+              <w:rPr>
+                <w:sz w:val="20"/>
+                <w:szCs w:val="20"/>
+              </w:rPr>
+              <w:t>Baja</w:t>
+            </w:r>
+          </w:p>
+        </w:tc>
+        <w:tc>
+          <w:tcPr>
+            <w:tcW w:w="0" w:type="auto"/>
+            <w:vAlign w:val="center"/>
+            <w:hideMark/>
+          </w:tcPr>
+          <w:p>
+            <w:pPr>
+              <w:rPr>
+                <w:sz w:val="20"/>
+                <w:szCs w:val="20"/>
+              </w:rPr>
+            </w:pPr>
+            <w:r>
+              <w:rPr>
+                <w:sz w:val="20"/>
+                <w:szCs w:val="20"/>
+              </w:rPr>
+              <w:t>Alto</w:t>
+            </w:r>
+          </w:p>
+        </w:tc>
+        <w:tc>
+          <w:tcPr>
+            <w:tcW w:w="0" w:type="auto"/>
+            <w:vAlign w:val="center"/>
+            <w:hideMark/>
+          </w:tcPr>
+          <w:p>
+            <w:pPr>
+              <w:rPr>
+                <w:sz w:val="20"/>
+                <w:szCs w:val="20"/>
+              </w:rPr>
+            </w:pPr>
+            <w:r>
+              <w:rPr>
+                <w:sz w:val="20"/>
+                <w:szCs w:val="20"/>
+              </w:rPr>
+              <w:t>Medio</w:t>
+            </w:r>
+          </w:p>
+        </w:tc>
+        <w:tc>
+          <w:tcPr>
+            <w:tcW w:w="0" w:type="auto"/>
+            <w:vAlign w:val="center"/>
+            <w:hideMark/>
+          </w:tcPr>
+          <w:p>
+            <w:pPr>
+              <w:rPr>
+                <w:sz w:val="20"/>
+                <w:szCs w:val="20"/>
+              </w:rPr>
+            </w:pPr>
+            <w:r>
+              <w:rPr>
+                <w:sz w:val="20"/>
+                <w:szCs w:val="20"/>
+              </w:rPr>
+              <w:t>Cumplimiento LGPD, GDPR y Ley 21.719, privacidad, cifrado, revisión legal continua</w:t>
+            </w:r>
+          </w:p>
+        </w:tc>
+        <w:tc>
+          <w:tcPr>
+            <w:tcW w:w="0" w:type="auto"/>
+            <w:vAlign w:val="center"/>
+            <w:hideMark/>
+          </w:tcPr>
+          <w:p>
+            <w:pPr>
+              <w:rPr>
+                <w:sz w:val="20"/>
+                <w:szCs w:val="20"/>
+              </w:rPr>
+            </w:pPr>
+            <w:r>
+              <w:rPr>
+                <w:sz w:val="20"/>
+                <w:szCs w:val="20"/>
+              </w:rPr>
+              <w:t>Evita multas hasta USD 1.500.000, y suspensión operativa</w:t>
+            </w:r>
+          </w:p>
+        </w:tc>
+      </w:tr>
+      <w:tr>
+        <w:trPr>
+          <w:tblCellSpacing w:w="15" w:type="dxa"/>
+        </w:trPr>
+        <w:tc>
+          <w:tcPr>
+            <w:tcW w:w="0" w:type="auto"/>
+            <w:vAlign w:val="center"/>
+            <w:hideMark/>
+          </w:tcPr>
+          <w:p>
+            <w:pPr>
+              <w:rPr>
+                <w:sz w:val="20"/>
+                <w:szCs w:val="20"/>
+              </w:rPr>
+            </w:pPr>
+            <w:r>
+              <w:rPr>
+                <w:sz w:val="20"/>
+                <w:szCs w:val="20"/>
+              </w:rPr>
+              <w:t>Seguridad</w:t>
+            </w:r>
+          </w:p>
+        </w:tc>
+        <w:tc>
+          <w:tcPr>
+            <w:tcW w:w="0" w:type="auto"/>
+            <w:vAlign w:val="center"/>
+            <w:hideMark/>
+          </w:tcPr>
+          <w:p>
+            <w:pPr>
+              <w:rPr>
+                <w:sz w:val="20"/>
+                <w:szCs w:val="20"/>
+              </w:rPr>
+            </w:pPr>
+            <w:r>
+              <w:rPr>
+                <w:sz w:val="20"/>
+                <w:szCs w:val="20"/>
+              </w:rPr>
+              <w:t>Ataque cibernético, fuga de datos</w:t>
+            </w:r>
+          </w:p>
+        </w:tc>
+        <w:tc>
+          <w:tcPr>
+            <w:tcW w:w="0" w:type="auto"/>
+            <w:vAlign w:val="center"/>
+            <w:hideMark/>
+          </w:tcPr>
+          <w:p>
+            <w:pPr>
+              <w:rPr>
+                <w:sz w:val="20"/>
+                <w:szCs w:val="20"/>
+              </w:rPr>
+            </w:pPr>
+            <w:r>
+              <w:rPr>
+                <w:sz w:val="20"/>
+                <w:szCs w:val="20"/>
+              </w:rPr>
+              <w:t>Baja</w:t>
+            </w:r>
+          </w:p>
+        </w:tc>
+        <w:tc>
+          <w:tcPr>
+            <w:tcW w:w="0" w:type="auto"/>
+            <w:vAlign w:val="center"/>
+            <w:hideMark/>
+          </w:tcPr>
+          <w:p>
+            <w:pPr>
+              <w:rPr>
+                <w:sz w:val="20"/>
+                <w:szCs w:val="20"/>
+              </w:rPr>
+            </w:pPr>
+            <w:r>
+              <w:rPr>
+                <w:sz w:val="20"/>
+                <w:szCs w:val="20"/>
+              </w:rPr>
+              <w:t>Muy alto</w:t>
+            </w:r>
+          </w:p>
+        </w:tc>
+        <w:tc>
+          <w:tcPr>
+            <w:tcW w:w="0" w:type="auto"/>
+            <w:vAlign w:val="center"/>
+            <w:hideMark/>
+          </w:tcPr>
+          <w:p>
+            <w:pPr>
+              <w:rPr>
+                <w:sz w:val="20"/>
+                <w:szCs w:val="20"/>
+              </w:rPr>
+            </w:pPr>
+            <w:r>
+              <w:rPr>
+                <w:sz w:val="20"/>
+                <w:szCs w:val="20"/>
+              </w:rPr>
+              <w:t>Alto</w:t>
+            </w:r>
+          </w:p>
+        </w:tc>
+        <w:tc>
+          <w:tcPr>
+            <w:tcW w:w="0" w:type="auto"/>
+            <w:vAlign w:val="center"/>
+            <w:hideMark/>
+          </w:tcPr>
+          <w:p>
+            <w:pPr>
+              <w:rPr>
+                <w:sz w:val="20"/>
+                <w:szCs w:val="20"/>
+              </w:rPr>
+            </w:pPr>
+            <w:r>
+              <w:rPr>
+                <w:sz w:val="20"/>
+                <w:szCs w:val="20"/>
+              </w:rPr>
+              <w:t>DevSecOps, backups, auditorías, capacitación usuarios, cifrado avanzado</w:t>
+            </w:r>
+          </w:p>
+        </w:tc>
+        <w:tc>
+          <w:tcPr>
+            <w:tcW w:w="0" w:type="auto"/>
+            <w:vAlign w:val="center"/>
+            <w:hideMark/>
+          </w:tcPr>
+          <w:p>
+            <w:pPr>
+              <w:rPr>
+                <w:sz w:val="20"/>
+                <w:szCs w:val="20"/>
+              </w:rPr>
+            </w:pPr>
+            <w:r>
+              <w:rPr>
+                <w:sz w:val="20"/>
+                <w:szCs w:val="20"/>
+              </w:rPr>
+              <w:t>Mitigación puede ahorrar hasta USD 900.000 por incidente</w:t>
+            </w:r>
+          </w:p>
+        </w:tc>
+      </w:tr>
+      <w:tr>
+        <w:trPr>
+          <w:tblCellSpacing w:w="15" w:type="dxa"/>
+        </w:trPr>
+        <w:tc>
+          <w:tcPr>
+            <w:tcW w:w="0" w:type="auto"/>
+            <w:vAlign w:val="center"/>
+            <w:hideMark/>
+          </w:tcPr>
+          <w:p>
+            <w:pPr>
+              <w:rPr>
+                <w:sz w:val="20"/>
+                <w:szCs w:val="20"/>
+              </w:rPr>
+            </w:pPr>
+            <w:r>
+              <w:rPr>
+                <w:sz w:val="20"/>
+                <w:szCs w:val="20"/>
+              </w:rPr>
+              <w:t>IA</w:t>
+            </w:r>
+          </w:p>
+        </w:tc>
+        <w:tc>
+          <w:tcPr>
+            <w:tcW w:w="0" w:type="auto"/>
+            <w:vAlign w:val="center"/>
+            <w:hideMark/>
+          </w:tcPr>
+          <w:p>
+            <w:pPr>
+              <w:rPr>
+                <w:sz w:val="20"/>
+                <w:szCs w:val="20"/>
+              </w:rPr>
+            </w:pPr>
+            <w:r>
+              <w:rPr>
+                <w:sz w:val="20"/>
+                <w:szCs w:val="20"/>
+              </w:rPr>
+              <w:t>Sesgo/baja calidad de datos, obsolescencia modelo</w:t>
+            </w:r>
+          </w:p>
+        </w:tc>
+        <w:tc>
+          <w:tcPr>
+            <w:tcW w:w="0" w:type="auto"/>
+            <w:vAlign w:val="center"/>
+            <w:hideMark/>
+          </w:tcPr>
+          <w:p>
+            <w:pPr>
+              <w:rPr>
+                <w:sz w:val="20"/>
+                <w:szCs w:val="20"/>
+              </w:rPr>
+            </w:pPr>
+            <w:r>
+              <w:rPr>
+                <w:sz w:val="20"/>
+                <w:szCs w:val="20"/>
+              </w:rPr>
+              <w:t>Media</w:t>
+            </w:r>
+          </w:p>
+        </w:tc>
+        <w:tc>
+          <w:tcPr>
+            <w:tcW w:w="0" w:type="auto"/>
+            <w:vAlign w:val="center"/>
+            <w:hideMark/>
+          </w:tcPr>
+          <w:p>
+            <w:pPr>
+              <w:rPr>
+                <w:sz w:val="20"/>
+                <w:szCs w:val="20"/>
+              </w:rPr>
+            </w:pPr>
+            <w:r>
+              <w:rPr>
+                <w:sz w:val="20"/>
+                <w:szCs w:val="20"/>
+              </w:rPr>
+              <w:t>Medio</w:t>
+            </w:r>
+          </w:p>
+        </w:tc>
+        <w:tc>
+          <w:tcPr>
+            <w:tcW w:w="0" w:type="auto"/>
+            <w:vAlign w:val="center"/>
+            <w:hideMark/>
+          </w:tcPr>
+          <w:p>
+            <w:pPr>
+              <w:rPr>
+                <w:sz w:val="20"/>
+                <w:szCs w:val="20"/>
+              </w:rPr>
+            </w:pPr>
+            <w:r>
+              <w:rPr>
+                <w:sz w:val="20"/>
+                <w:szCs w:val="20"/>
+              </w:rPr>
+              <w:t>Medio</w:t>
+            </w:r>
+          </w:p>
+        </w:tc>
+        <w:tc>
+          <w:tcPr>
+            <w:tcW w:w="0" w:type="auto"/>
+            <w:vAlign w:val="center"/>
+            <w:hideMark/>
+          </w:tcPr>
+          <w:p>
+            <w:pPr>
+              <w:rPr>
+                <w:sz w:val="20"/>
+                <w:szCs w:val="20"/>
+              </w:rPr>
+            </w:pPr>
+            <w:r>
+              <w:rPr>
+                <w:sz w:val="20"/>
+                <w:szCs w:val="20"/>
+              </w:rPr>
+              <w:t>Evaluar y actualizar datasets, revisión ética, actualización periódica IA</w:t>
+            </w:r>
+          </w:p>
+        </w:tc>
+        <w:tc>
+          <w:tcPr>
+            <w:tcW w:w="0" w:type="auto"/>
+            <w:vAlign w:val="center"/>
+            <w:hideMark/>
+          </w:tcPr>
+          <w:p>
+            <w:pPr>
+              <w:rPr>
+                <w:sz w:val="20"/>
+                <w:szCs w:val="20"/>
+              </w:rPr>
+            </w:pPr>
+            <w:r>
+              <w:rPr>
+                <w:sz w:val="20"/>
+                <w:szCs w:val="20"/>
+              </w:rPr>
+              <w:t>Previene pérdida de credibilidad y riesgo legal; difícil de cuantificar, hasta USD 10.000 reputacionales</w:t>
+            </w:r>
+          </w:p>
+        </w:tc>
+      </w:tr>
+      <w:tr>
+        <w:trPr>
+          <w:tblCellSpacing w:w="15" w:type="dxa"/>
+        </w:trPr>
+        <w:tc>
+          <w:tcPr>
+            <w:tcW w:w="0" w:type="auto"/>
+            <w:vAlign w:val="center"/>
+            <w:hideMark/>
+          </w:tcPr>
+          <w:p>
+            <w:pPr>
+              <w:rPr>
+                <w:sz w:val="20"/>
+                <w:szCs w:val="20"/>
+              </w:rPr>
+            </w:pPr>
+            <w:r>
+              <w:rPr>
+                <w:sz w:val="20"/>
+                <w:szCs w:val="20"/>
+              </w:rPr>
+              <w:t>Dependencia</w:t>
+            </w:r>
+          </w:p>
+        </w:tc>
+        <w:tc>
+          <w:tcPr>
+            <w:tcW w:w="0" w:type="auto"/>
+            <w:vAlign w:val="center"/>
+            <w:hideMark/>
+          </w:tcPr>
+          <w:p>
+            <w:pPr>
+              <w:rPr>
+                <w:sz w:val="20"/>
+                <w:szCs w:val="20"/>
+              </w:rPr>
+            </w:pPr>
+            <w:r>
+              <w:rPr>
+                <w:sz w:val="20"/>
+                <w:szCs w:val="20"/>
+              </w:rPr>
+              <w:t xml:space="preserve">Falla o cambios en </w:t>
+            </w:r>
+            <w:r>
+              <w:rPr>
+                <w:sz w:val="20"/>
+                <w:szCs w:val="20"/>
+              </w:rPr>
+              <w:lastRenderedPageBreak/>
+              <w:t>APIs/proveedores externos</w:t>
+            </w:r>
+          </w:p>
+        </w:tc>
+        <w:tc>
+          <w:tcPr>
+            <w:tcW w:w="0" w:type="auto"/>
+            <w:vAlign w:val="center"/>
+            <w:hideMark/>
+          </w:tcPr>
+          <w:p>
+            <w:pPr>
+              <w:rPr>
+                <w:sz w:val="20"/>
+                <w:szCs w:val="20"/>
+              </w:rPr>
+            </w:pPr>
+            <w:r>
+              <w:rPr>
+                <w:sz w:val="20"/>
+                <w:szCs w:val="20"/>
+              </w:rPr>
+              <w:lastRenderedPageBreak/>
+              <w:t>Baja</w:t>
+            </w:r>
+          </w:p>
+        </w:tc>
+        <w:tc>
+          <w:tcPr>
+            <w:tcW w:w="0" w:type="auto"/>
+            <w:vAlign w:val="center"/>
+            <w:hideMark/>
+          </w:tcPr>
+          <w:p>
+            <w:pPr>
+              <w:rPr>
+                <w:sz w:val="20"/>
+                <w:szCs w:val="20"/>
+              </w:rPr>
+            </w:pPr>
+            <w:r>
+              <w:rPr>
+                <w:sz w:val="20"/>
+                <w:szCs w:val="20"/>
+              </w:rPr>
+              <w:t>Alto</w:t>
+            </w:r>
+          </w:p>
+        </w:tc>
+        <w:tc>
+          <w:tcPr>
+            <w:tcW w:w="0" w:type="auto"/>
+            <w:vAlign w:val="center"/>
+            <w:hideMark/>
+          </w:tcPr>
+          <w:p>
+            <w:pPr>
+              <w:rPr>
+                <w:sz w:val="20"/>
+                <w:szCs w:val="20"/>
+              </w:rPr>
+            </w:pPr>
+            <w:r>
+              <w:rPr>
+                <w:sz w:val="20"/>
+                <w:szCs w:val="20"/>
+              </w:rPr>
+              <w:t>Medio</w:t>
+            </w:r>
+          </w:p>
+        </w:tc>
+        <w:tc>
+          <w:tcPr>
+            <w:tcW w:w="0" w:type="auto"/>
+            <w:vAlign w:val="center"/>
+            <w:hideMark/>
+          </w:tcPr>
+          <w:p>
+            <w:pPr>
+              <w:rPr>
+                <w:sz w:val="20"/>
+                <w:szCs w:val="20"/>
+              </w:rPr>
+            </w:pPr>
+            <w:r>
+              <w:rPr>
+                <w:sz w:val="20"/>
+                <w:szCs w:val="20"/>
+              </w:rPr>
+              <w:t xml:space="preserve">Contratos flexibles, </w:t>
+            </w:r>
+            <w:r>
+              <w:rPr>
+                <w:sz w:val="20"/>
+                <w:szCs w:val="20"/>
+              </w:rPr>
+              <w:lastRenderedPageBreak/>
+              <w:t>pruebas de fallback/manual, arquitectura desacoplada</w:t>
+            </w:r>
+          </w:p>
+        </w:tc>
+        <w:tc>
+          <w:tcPr>
+            <w:tcW w:w="0" w:type="auto"/>
+            <w:vAlign w:val="center"/>
+            <w:hideMark/>
+          </w:tcPr>
+          <w:p>
+            <w:pPr>
+              <w:rPr>
+                <w:sz w:val="20"/>
+                <w:szCs w:val="20"/>
+              </w:rPr>
+            </w:pPr>
+            <w:r>
+              <w:rPr>
+                <w:sz w:val="20"/>
+                <w:szCs w:val="20"/>
+              </w:rPr>
+              <w:lastRenderedPageBreak/>
+              <w:t xml:space="preserve">Reduce riesgo de tiempo </w:t>
+            </w:r>
+            <w:r>
+              <w:rPr>
+                <w:sz w:val="20"/>
+                <w:szCs w:val="20"/>
+              </w:rPr>
+              <w:lastRenderedPageBreak/>
+              <w:t>inactivo (&gt;USD 3.000/hora en PYMES)</w:t>
+            </w:r>
+          </w:p>
+        </w:tc>
+      </w:tr>
+    </w:tbl>
     <w:p/>
+    <w:p>
+      <w:pPr>
+        <w:rPr>
+          <w:b/>
+          <w:bCs/>
+        </w:rPr>
+      </w:pPr>
+      <w:r>
+        <w:rPr>
+          <w:b/>
+          <w:bCs/>
+        </w:rPr>
+        <w:t>DEFINICIÓN Y BENEFICIO DE CADA MITIGACIÓN</w:t>
+      </w:r>
+    </w:p>
+    <w:p>
+      <w:pPr>
+        <w:numPr>
+          <w:ilvl w:val="0"/>
+          <w:numId w:val="7"/>
+        </w:numPr>
+      </w:pPr>
+      <w:r>
+        <w:rPr>
+          <w:b/>
+          <w:bCs/>
+        </w:rPr>
+        <w:t>Cumplimiento Legal/Ethical</w:t>
+      </w:r>
+      <w:r>
+        <w:t>: Cumplir proactivamente con normativas (LGPD, GDPR, Ley 21.719) evita multas de hasta USD 1.5 millones y cierre temporal de operaciones. El monitoreo legal regular, asesoría jurídica y ajuste de políticas aportan altos retornos frente al costo (asesoría legal anual: USD 2.000-5.000).</w:t>
+      </w:r>
+    </w:p>
+    <w:p>
+      <w:pPr>
+        <w:numPr>
+          <w:ilvl w:val="0"/>
+          <w:numId w:val="7"/>
+        </w:numPr>
+      </w:pPr>
+      <w:r>
+        <w:rPr>
+          <w:b/>
+          <w:bCs/>
+        </w:rPr>
+        <w:t>Ciberseguridad Proactiva</w:t>
+      </w:r>
+      <w:r>
+        <w:t>: Implementar DevSecOps, cifrado y protocolos de backup puede reducir el costo de incidentes cibernéticos en un 35% (ahorro medio por incidente: USD 900.000).</w:t>
+      </w:r>
+      <w:hyperlink r:id="rId48" w:tgtFrame="_blank" w:history="1">
+        <w:r>
+          <w:rPr>
+            <w:rStyle w:val="Hipervnculo"/>
+          </w:rPr>
+          <w:t>flane</w:t>
+        </w:r>
+      </w:hyperlink>
+    </w:p>
+    <w:p>
+      <w:pPr>
+        <w:numPr>
+          <w:ilvl w:val="0"/>
+          <w:numId w:val="7"/>
+        </w:numPr>
+      </w:pPr>
+      <w:r>
+        <w:rPr>
+          <w:b/>
+          <w:bCs/>
+        </w:rPr>
+        <w:t>Gestión de Dependencias Tecnológicas</w:t>
+      </w:r>
+      <w:r>
+        <w:t>: Arquitectura desacoplada y contratos flexibles mitigan el riesgo por fallos de proveedores, evitando costes inmediatos por horas caídas (PYMES: USD 3.000/hora).</w:t>
+      </w:r>
+      <w:hyperlink r:id="rId49" w:tgtFrame="_blank" w:history="1">
+        <w:r>
+          <w:rPr>
+            <w:rStyle w:val="Hipervnculo"/>
+          </w:rPr>
+          <w:t>trilio</w:t>
+        </w:r>
+      </w:hyperlink>
+    </w:p>
+    <w:p>
+      <w:pPr>
+        <w:numPr>
+          <w:ilvl w:val="0"/>
+          <w:numId w:val="7"/>
+        </w:numPr>
+      </w:pPr>
+      <w:r>
+        <w:rPr>
+          <w:b/>
+          <w:bCs/>
+        </w:rPr>
+        <w:t>Manejo de Sesgo y Obsolescencia IA</w:t>
+      </w:r>
+      <w:r>
+        <w:t>: La actualización periódica de datasets y auditoría de modelos garantiza precisión y equidad, previniendo pérdidas legales y reputacionales.</w:t>
+      </w:r>
+    </w:p>
+    <w:p>
+      <w:pPr>
+        <w:numPr>
+          <w:ilvl w:val="0"/>
+          <w:numId w:val="7"/>
+        </w:numPr>
+      </w:pPr>
+      <w:r>
+        <w:rPr>
+          <w:b/>
+          <w:bCs/>
+        </w:rPr>
+        <w:t>Monitoreo Continuo y Feedback</w:t>
+      </w:r>
+      <w:r>
+        <w:t>: Revisiones semanales y métricas clave respaldan una detección temprana de riesgos, permitiendo reacción ágil y ahorro en costos operativos y comerciales.</w:t>
+      </w:r>
+    </w:p>
+    <w:p/>
+    <w:p>
+      <w:pPr>
+        <w:rPr>
+          <w:b/>
+          <w:bCs/>
+        </w:rPr>
+      </w:pPr>
+      <w:r>
+        <w:rPr>
+          <w:b/>
+          <w:bCs/>
+        </w:rPr>
+        <w:t>CONCLUSIÓN ESTRATÉGICA</w:t>
+      </w:r>
+    </w:p>
+    <w:p>
+      <w:r>
+        <w:t xml:space="preserve">La integración de mitigaciones avanzadas no solo reduce notablemente el impacto financiero de incidentes críticos (multas, ciberataques, pérdidas reputacionales), sino que también posiciona a SmartSwim como plataforma responsable y robusta. La inversión en mitigación (equipo DevSecOps, asesoría legal, control operativo) es sustancialmente inferior al costo potencial de los riesgos sin gestión, generando un </w:t>
+      </w:r>
+      <w:r>
+        <w:lastRenderedPageBreak/>
+        <w:t>ahorro justificado y medible, además de brindar confianza a usuarios, clubes y partners.</w:t>
+      </w:r>
+      <w:hyperlink r:id="rId50" w:tgtFrame="_blank" w:history="1">
+        <w:r>
+          <w:rPr>
+            <w:rStyle w:val="Hipervnculo"/>
+          </w:rPr>
+          <w:t>gerencia+3</w:t>
+        </w:r>
+      </w:hyperlink>
+    </w:p>
+    <w:p>
+      <w:r>
+        <w:pict w14:anchorId="571FE8BE">
+          <v:rect id="_x0000_i1053" style="width:0;height:1.5pt" o:hralign="center" o:hrstd="t" o:hr="t" fillcolor="#a0a0a0" stroked="f"/>
+        </w:pict>
+      </w:r>
+    </w:p>
+    <w:p>
+      <w:pPr>
+        <w:numPr>
+          <w:ilvl w:val="0"/>
+          <w:numId w:val="8"/>
+        </w:numPr>
+      </w:pPr>
+      <w:hyperlink r:id="rId51" w:history="1">
+        <w:r>
+          <w:rPr>
+            <w:rStyle w:val="Hipervnculo"/>
+          </w:rPr>
+          <w:t>https://www.flane.com.pa/blog/es/seguridad-impulsada-por-ia-la-clave-para-reducir-costos-de-filtraciones-de-datos-en-latinoamerica/</w:t>
+        </w:r>
+      </w:hyperlink>
+    </w:p>
+    <w:p>
+      <w:pPr>
+        <w:numPr>
+          <w:ilvl w:val="0"/>
+          <w:numId w:val="8"/>
+        </w:numPr>
+      </w:pPr>
+      <w:hyperlink r:id="rId52" w:history="1">
+        <w:r>
+          <w:rPr>
+            <w:rStyle w:val="Hipervnculo"/>
+          </w:rPr>
+          <w:t>https://trilio.io/es/digitales/costo-del-tiempo-de-inactividad/</w:t>
+        </w:r>
+      </w:hyperlink>
+    </w:p>
+    <w:p>
+      <w:pPr>
+        <w:numPr>
+          <w:ilvl w:val="0"/>
+          <w:numId w:val="8"/>
+        </w:numPr>
+      </w:pPr>
+      <w:hyperlink r:id="rId53" w:history="1">
+        <w:r>
+          <w:rPr>
+            <w:rStyle w:val="Hipervnculo"/>
+          </w:rPr>
+          <w:t>https://www.gerencia.cl/senza-categoria/proteccion-de-datos-las-sanciones-que-trae-la-nueva-ley/</w:t>
+        </w:r>
+      </w:hyperlink>
+    </w:p>
+    <w:p>
+      <w:pPr>
+        <w:numPr>
+          <w:ilvl w:val="0"/>
+          <w:numId w:val="8"/>
+        </w:numPr>
+      </w:pPr>
+      <w:hyperlink r:id="rId54" w:history="1">
+        <w:r>
+          <w:rPr>
+            <w:rStyle w:val="Hipervnculo"/>
+          </w:rPr>
+          <w:t>https://www.ibm.com/es-es/reports/data-breach</w:t>
+        </w:r>
+      </w:hyperlink>
+    </w:p>
+    <w:p>
+      <w:pPr>
+        <w:numPr>
+          <w:ilvl w:val="0"/>
+          <w:numId w:val="8"/>
+        </w:numPr>
+      </w:pPr>
+      <w:hyperlink r:id="rId55" w:history="1">
+        <w:r>
+          <w:rPr>
+            <w:rStyle w:val="Hipervnculo"/>
+          </w:rPr>
+          <w:t>https://translate.google.com/translate?u=https%3A%2F%2Fwww.polymerhq.io%2Fblog%2Fwhy-data-breach-costs-will-reach-new-heights-in-2025%2F&amp;hl=es&amp;sl=en&amp;tl=es&amp;client=srp</w:t>
+        </w:r>
+      </w:hyperlink>
+    </w:p>
+    <w:p>
+      <w:pPr>
+        <w:numPr>
+          <w:ilvl w:val="0"/>
+          <w:numId w:val="8"/>
+        </w:numPr>
+      </w:pPr>
+      <w:hyperlink r:id="rId56" w:history="1">
+        <w:r>
+          <w:rPr>
+            <w:rStyle w:val="Hipervnculo"/>
+          </w:rPr>
+          <w:t>https://translate.google.com/translate?u=https%3A%2F%2Fblog.dreamfactory.com%2Fapi-cost-calculator&amp;hl=es&amp;sl=en&amp;tl=es&amp;client=srp</w:t>
+        </w:r>
+      </w:hyperlink>
+    </w:p>
+    <w:p>
+      <w:pPr>
+        <w:numPr>
+          <w:ilvl w:val="0"/>
+          <w:numId w:val="8"/>
+        </w:numPr>
+      </w:pPr>
+      <w:hyperlink r:id="rId57" w:history="1">
+        <w:r>
+          <w:rPr>
+            <w:rStyle w:val="Hipervnculo"/>
+          </w:rPr>
+          <w:t>https://www.latercera.com/piensa-digital/noticia/por-que-el-costo-de-la-ciberseguridad-en-latinoamerica-va-en-aumento/MQQ246Z6NBGNDDFJT32HNTLQ6M/</w:t>
+        </w:r>
+      </w:hyperlink>
+    </w:p>
+    <w:p>
+      <w:pPr>
+        <w:numPr>
+          <w:ilvl w:val="0"/>
+          <w:numId w:val="8"/>
+        </w:numPr>
+      </w:pPr>
+      <w:hyperlink r:id="rId58" w:history="1">
+        <w:r>
+          <w:rPr>
+            <w:rStyle w:val="Hipervnculo"/>
+          </w:rPr>
+          <w:t>https://neuronet.cl/ley-marco-de-ciberseguridad-en-chile-guia-completa-2025/</w:t>
+        </w:r>
+      </w:hyperlink>
+    </w:p>
+    <w:p>
+      <w:pPr>
+        <w:numPr>
+          <w:ilvl w:val="0"/>
+          <w:numId w:val="8"/>
+        </w:numPr>
+      </w:pPr>
+      <w:hyperlink r:id="rId59" w:history="1">
+        <w:r>
+          <w:rPr>
+            <w:rStyle w:val="Hipervnculo"/>
+          </w:rPr>
+          <w:t>https://www.akamai.com/es/glossary/what-are-api-security-breaches</w:t>
+        </w:r>
+      </w:hyperlink>
+    </w:p>
+    <w:p>
+      <w:pPr>
+        <w:numPr>
+          <w:ilvl w:val="0"/>
+          <w:numId w:val="8"/>
+        </w:numPr>
+      </w:pPr>
+      <w:hyperlink r:id="rId60" w:history="1">
+        <w:r>
+          <w:rPr>
+            <w:rStyle w:val="Hipervnculo"/>
+          </w:rPr>
+          <w:t>https://translate.google.com/translate?u=https%3A%2F%2Fdigitaldefynd.com%2FIQ%2Fsports-cybersecurity-case-studies%2F&amp;hl=es&amp;sl=en&amp;tl=es&amp;client=srp</w:t>
+        </w:r>
+      </w:hyperlink>
+    </w:p>
+    <w:p>
+      <w:pPr>
+        <w:numPr>
+          <w:ilvl w:val="0"/>
+          <w:numId w:val="8"/>
+        </w:numPr>
+      </w:pPr>
+      <w:hyperlink r:id="rId61" w:history="1">
+        <w:r>
+          <w:rPr>
+            <w:rStyle w:val="Hipervnculo"/>
+          </w:rPr>
+          <w:t>https://www.soho.lat/ciberseguridad-y-datos-chile-2025/</w:t>
+        </w:r>
+      </w:hyperlink>
+    </w:p>
+    <w:p>
+      <w:pPr>
+        <w:numPr>
+          <w:ilvl w:val="0"/>
+          <w:numId w:val="8"/>
+        </w:numPr>
+      </w:pPr>
+      <w:hyperlink r:id="rId62" w:history="1">
+        <w:r>
+          <w:rPr>
+            <w:rStyle w:val="Hipervnculo"/>
+          </w:rPr>
+          <w:t>https://www.loadview-testing.com/es/la-guia-definitiva-para-la-supervision-de-api/</w:t>
+        </w:r>
+      </w:hyperlink>
+    </w:p>
+    <w:p>
+      <w:pPr>
+        <w:numPr>
+          <w:ilvl w:val="0"/>
+          <w:numId w:val="8"/>
+        </w:numPr>
+      </w:pPr>
+      <w:hyperlink r:id="rId63" w:history="1">
+        <w:r>
+          <w:rPr>
+            <w:rStyle w:val="Hipervnculo"/>
+          </w:rPr>
+          <w:t>https://es.newsroom.ibm.com/announcements?item=122884</w:t>
+        </w:r>
+      </w:hyperlink>
+    </w:p>
+    <w:p>
+      <w:pPr>
+        <w:numPr>
+          <w:ilvl w:val="0"/>
+          <w:numId w:val="8"/>
+        </w:numPr>
+      </w:pPr>
+      <w:hyperlink r:id="rId64" w:history="1">
+        <w:r>
+          <w:rPr>
+            <w:rStyle w:val="Hipervnculo"/>
+          </w:rPr>
+          <w:t>https://translate.google.com/translate?u=https%3A%2F%2Fusercentrics.com%2Fknowledge-hub%2F2024-privacy-challenges-for-apps-and-games-publishers%2F&amp;hl=es&amp;sl=en&amp;tl=es&amp;client=srp</w:t>
+        </w:r>
+      </w:hyperlink>
+    </w:p>
+    <w:p>
+      <w:pPr>
+        <w:numPr>
+          <w:ilvl w:val="0"/>
+          <w:numId w:val="8"/>
+        </w:numPr>
+      </w:pPr>
+      <w:hyperlink r:id="rId65" w:history="1">
+        <w:r>
+          <w:rPr>
+            <w:rStyle w:val="Hipervnculo"/>
+          </w:rPr>
+          <w:t>https://translate.google.com/translate?u=https%3A%2F%2Fsdk.finance%2Fapi-in-banking-types-and-benefits%2F&amp;hl=es&amp;sl=en&amp;tl=es&amp;client=srp</w:t>
+        </w:r>
+      </w:hyperlink>
+    </w:p>
+    <w:p>
+      <w:pPr>
+        <w:numPr>
+          <w:ilvl w:val="0"/>
+          <w:numId w:val="8"/>
+        </w:numPr>
+      </w:pPr>
+      <w:hyperlink r:id="rId66" w:history="1">
+        <w:r>
+          <w:rPr>
+            <w:rStyle w:val="Hipervnculo"/>
+          </w:rPr>
+          <w:t>https://www.wtwco.com/es-es/insights/2025/07/ciberseguridad-costes-causas-ataques-mas-comunes</w:t>
+        </w:r>
+      </w:hyperlink>
+    </w:p>
+    <w:p>
+      <w:pPr>
+        <w:numPr>
+          <w:ilvl w:val="0"/>
+          <w:numId w:val="8"/>
+        </w:numPr>
+      </w:pPr>
+      <w:hyperlink r:id="rId67" w:history="1">
+        <w:r>
+          <w:rPr>
+            <w:rStyle w:val="Hipervnculo"/>
+          </w:rPr>
+          <w:t>https://gooapps.es/2025/03/14/cuanto-cuesta-mantener-una-app/</w:t>
+        </w:r>
+      </w:hyperlink>
+    </w:p>
+    <w:p>
+      <w:pPr>
+        <w:numPr>
+          <w:ilvl w:val="0"/>
+          <w:numId w:val="8"/>
+        </w:numPr>
+      </w:pPr>
+      <w:hyperlink r:id="rId68" w:history="1">
+        <w:r>
+          <w:rPr>
+            <w:rStyle w:val="Hipervnculo"/>
+          </w:rPr>
+          <w:t>https://www.edapi.cl/inactividad-ti-cuales-son-sus-riesgos-y-consecuencias-nice/</w:t>
+        </w:r>
+      </w:hyperlink>
+    </w:p>
+    <w:p>
+      <w:pPr>
+        <w:numPr>
+          <w:ilvl w:val="0"/>
+          <w:numId w:val="8"/>
+        </w:numPr>
+      </w:pPr>
+      <w:hyperlink r:id="rId69" w:history="1">
+        <w:r>
+          <w:rPr>
+            <w:rStyle w:val="Hipervnculo"/>
+          </w:rPr>
+          <w:t>https://www.innovaciondigital360.com/cyber-security/costos-de-ciberseguridad-las-claves-para-definirlo/</w:t>
+        </w:r>
+      </w:hyperlink>
+    </w:p>
+    <w:p>
+      <w:pPr>
+        <w:numPr>
+          <w:ilvl w:val="0"/>
+          <w:numId w:val="8"/>
+        </w:numPr>
+      </w:pPr>
+      <w:hyperlink r:id="rId70" w:history="1">
+        <w:r>
+          <w:rPr>
+            <w:rStyle w:val="Hipervnculo"/>
+          </w:rPr>
+          <w:t>https://www.statista.com/statistics/1170520/worldwide-data-breach-fines-settlements/</w:t>
+        </w:r>
+      </w:hyperlink>
+    </w:p>
     <w:p/>
     <w:sectPr>
       <w:pgSz w:w="12240" w:h="15840"/>
@@ -4146,6 +6093,119 @@
     </w:lvl>
   </w:abstractNum>
   <w:abstractNum w:abstractNumId="1" w15:restartNumberingAfterBreak="0">
+    <w:nsid w:val="0FAE346A"/>
+    <w:multiLevelType w:val="multilevel"/>
+    <w:tmpl w:val="F6165CD6"/>
+    <w:lvl w:ilvl="0">
+      <w:start w:val="1"/>
+      <w:numFmt w:val="decimal"/>
+      <w:lvlText w:val="%1."/>
+      <w:lvlJc w:val="left"/>
+      <w:pPr>
+        <w:tabs>
+          <w:tab w:val="num" w:pos="720"/>
+        </w:tabs>
+        <w:ind w:left="720" w:hanging="360"/>
+      </w:pPr>
+    </w:lvl>
+    <w:lvl w:ilvl="1" w:tentative="1">
+      <w:start w:val="1"/>
+      <w:numFmt w:val="decimal"/>
+      <w:lvlText w:val="%2."/>
+      <w:lvlJc w:val="left"/>
+      <w:pPr>
+        <w:tabs>
+          <w:tab w:val="num" w:pos="1440"/>
+        </w:tabs>
+        <w:ind w:left="1440" w:hanging="360"/>
+      </w:pPr>
+    </w:lvl>
+    <w:lvl w:ilvl="2" w:tentative="1">
+      <w:start w:val="1"/>
+      <w:numFmt w:val="decimal"/>
+      <w:lvlText w:val="%3."/>
+      <w:lvlJc w:val="left"/>
+      <w:pPr>
+        <w:tabs>
+          <w:tab w:val="num" w:pos="2160"/>
+        </w:tabs>
+        <w:ind w:left="2160" w:hanging="360"/>
+      </w:pPr>
+    </w:lvl>
+    <w:lvl w:ilvl="3" w:tentative="1">
+      <w:start w:val="1"/>
+      <w:numFmt w:val="decimal"/>
+      <w:lvlText w:val="%4."/>
+      <w:lvlJc w:val="left"/>
+      <w:pPr>
+        <w:tabs>
+          <w:tab w:val="num" w:pos="2880"/>
+        </w:tabs>
+        <w:ind w:left="2880" w:hanging="360"/>
+      </w:pPr>
+    </w:lvl>
+    <w:lvl w:ilvl="4" w:tentative="1">
+      <w:start w:val="1"/>
+      <w:numFmt w:val="decimal"/>
+      <w:lvlText w:val="%5."/>
+      <w:lvlJc w:val="left"/>
+      <w:pPr>
+        <w:tabs>
+          <w:tab w:val="num" w:pos="3600"/>
+        </w:tabs>
+        <w:ind w:left="3600" w:hanging="360"/>
+      </w:pPr>
+    </w:lvl>
+    <w:lvl w:ilvl="5" w:tentative="1">
+      <w:start w:val="1"/>
+      <w:numFmt w:val="decimal"/>
+      <w:lvlText w:val="%6."/>
+      <w:lvlJc w:val="left"/>
+      <w:pPr>
+        <w:tabs>
+          <w:tab w:val="num" w:pos="4320"/>
+        </w:tabs>
+        <w:ind w:left="4320" w:hanging="360"/>
+      </w:pPr>
+    </w:lvl>
+    <w:lvl w:ilvl="6" w:tentative="1">
+      <w:start w:val="1"/>
+      <w:numFmt w:val="decimal"/>
+      <w:lvlText w:val="%7."/>
+      <w:lvlJc w:val="left"/>
+      <w:pPr>
+        <w:tabs>
+          <w:tab w:val="num" w:pos="5040"/>
+        </w:tabs>
+        <w:ind w:left="5040" w:hanging="360"/>
+      </w:pPr>
+    </w:lvl>
+    <w:lvl w:ilvl="7" w:tentative="1">
+      <w:start w:val="1"/>
+      <w:numFmt w:val="decimal"/>
+      <w:lvlText w:val="%8."/>
+      <w:lvlJc w:val="left"/>
+      <w:pPr>
+        <w:tabs>
+          <w:tab w:val="num" w:pos="5760"/>
+        </w:tabs>
+        <w:ind w:left="5760" w:hanging="360"/>
+      </w:pPr>
+    </w:lvl>
+    <w:lvl w:ilvl="8" w:tentative="1">
+      <w:start w:val="1"/>
+      <w:numFmt w:val="decimal"/>
+      <w:lvlText w:val="%9."/>
+      <w:lvlJc w:val="left"/>
+      <w:pPr>
+        <w:tabs>
+          <w:tab w:val="num" w:pos="6480"/>
+        </w:tabs>
+        <w:ind w:left="6480" w:hanging="360"/>
+      </w:pPr>
+    </w:lvl>
+  </w:abstractNum>
+  <w:abstractNum w:abstractNumId="2" w15:restartNumberingAfterBreak="0">
     <w:nsid w:val="2A8142C0"/>
     <w:multiLevelType w:val="multilevel"/>
     <w:tmpl w:val="0090F1AA"/>
@@ -4258,7 +6318,156 @@
       </w:pPr>
     </w:lvl>
   </w:abstractNum>
-  <w:abstractNum w:abstractNumId="2" w15:restartNumberingAfterBreak="0">
+  <w:abstractNum w:abstractNumId="3" w15:restartNumberingAfterBreak="0">
+    <w:nsid w:val="48693212"/>
+    <w:multiLevelType w:val="multilevel"/>
+    <w:tmpl w:val="37DC74F6"/>
+    <w:lvl w:ilvl="0">
+      <w:start w:val="1"/>
+      <w:numFmt w:val="bullet"/>
+      <w:lvlText w:val=""/>
+      <w:lvlJc w:val="left"/>
+      <w:pPr>
+        <w:tabs>
+          <w:tab w:val="num" w:pos="720"/>
+        </w:tabs>
+        <w:ind w:left="720" w:hanging="360"/>
+      </w:pPr>
+      <w:rPr>
+        <w:rFonts w:ascii="Symbol" w:hAnsi="Symbol" w:hint="default"/>
+        <w:sz w:val="20"/>
+      </w:rPr>
+    </w:lvl>
+    <w:lvl w:ilvl="1" w:tentative="1">
+      <w:start w:val="1"/>
+      <w:numFmt w:val="bullet"/>
+      <w:lvlText w:val="o"/>
+      <w:lvlJc w:val="left"/>
+      <w:pPr>
+        <w:tabs>
+          <w:tab w:val="num" w:pos="1440"/>
+        </w:tabs>
+        <w:ind w:left="1440" w:hanging="360"/>
+      </w:pPr>
+      <w:rPr>
+        <w:rFonts w:ascii="Courier New" w:hAnsi="Courier New" w:hint="default"/>
+        <w:sz w:val="20"/>
+      </w:rPr>
+    </w:lvl>
+    <w:lvl w:ilvl="2" w:tentative="1">
+      <w:start w:val="1"/>
+      <w:numFmt w:val="bullet"/>
+      <w:lvlText w:val=""/>
+      <w:lvlJc w:val="left"/>
+      <w:pPr>
+        <w:tabs>
+          <w:tab w:val="num" w:pos="2160"/>
+        </w:tabs>
+        <w:ind w:left="2160" w:hanging="360"/>
+      </w:pPr>
+      <w:rPr>
+        <w:rFonts w:ascii="Wingdings" w:hAnsi="Wingdings" w:hint="default"/>
+        <w:sz w:val="20"/>
+      </w:rPr>
+    </w:lvl>
+    <w:lvl w:ilvl="3" w:tentative="1">
+      <w:start w:val="1"/>
+      <w:numFmt w:val="bullet"/>
+      <w:lvlText w:val=""/>
+      <w:lvlJc w:val="left"/>
+      <w:pPr>
+        <w:tabs>
+          <w:tab w:val="num" w:pos="2880"/>
+        </w:tabs>
+        <w:ind w:left="2880" w:hanging="360"/>
+      </w:pPr>
+      <w:rPr>
+        <w:rFonts w:ascii="Wingdings" w:hAnsi="Wingdings" w:hint="default"/>
+        <w:sz w:val="20"/>
+      </w:rPr>
+    </w:lvl>
+    <w:lvl w:ilvl="4" w:tentative="1">
+      <w:start w:val="1"/>
+      <w:numFmt w:val="bullet"/>
+      <w:lvlText w:val=""/>
+      <w:lvlJc w:val="left"/>
+      <w:pPr>
+        <w:tabs>
+          <w:tab w:val="num" w:pos="3600"/>
+        </w:tabs>
+        <w:ind w:left="3600" w:hanging="360"/>
+      </w:pPr>
+      <w:rPr>
+        <w:rFonts w:ascii="Wingdings" w:hAnsi="Wingdings" w:hint="default"/>
+        <w:sz w:val="20"/>
+      </w:rPr>
+    </w:lvl>
+    <w:lvl w:ilvl="5" w:tentative="1">
+      <w:start w:val="1"/>
+      <w:numFmt w:val="bullet"/>
+      <w:lvlText w:val=""/>
+      <w:lvlJc w:val="left"/>
+      <w:pPr>
+        <w:tabs>
+          <w:tab w:val="num" w:pos="4320"/>
+        </w:tabs>
+        <w:ind w:left="4320" w:hanging="360"/>
+      </w:pPr>
+      <w:rPr>
+        <w:rFonts w:ascii="Wingdings" w:hAnsi="Wingdings" w:hint="default"/>
+        <w:sz w:val="20"/>
+      </w:rPr>
+    </w:lvl>
+    <w:lvl w:ilvl="6" w:tentative="1">
+      <w:start w:val="1"/>
+      <w:numFmt w:val="bullet"/>
+      <w:lvlText w:val=""/>
+      <w:lvlJc w:val="left"/>
+      <w:pPr>
+        <w:tabs>
+          <w:tab w:val="num" w:pos="5040"/>
+        </w:tabs>
+        <w:ind w:left="5040" w:hanging="360"/>
+      </w:pPr>
+      <w:rPr>
+        <w:rFonts w:ascii="Wingdings" w:hAnsi="Wingdings" w:hint="default"/>
+        <w:sz w:val="20"/>
+      </w:rPr>
+    </w:lvl>
+    <w:lvl w:ilvl="7" w:tentative="1">
+      <w:start w:val="1"/>
+      <w:numFmt w:val="bullet"/>
+      <w:lvlText w:val=""/>
+      <w:lvlJc w:val="left"/>
+      <w:pPr>
+        <w:tabs>
+          <w:tab w:val="num" w:pos="5760"/>
+        </w:tabs>
+        <w:ind w:left="5760" w:hanging="360"/>
+      </w:pPr>
+      <w:rPr>
+        <w:rFonts w:ascii="Wingdings" w:hAnsi="Wingdings" w:hint="default"/>
+        <w:sz w:val="20"/>
+      </w:rPr>
+    </w:lvl>
+    <w:lvl w:ilvl="8" w:tentative="1">
+      <w:start w:val="1"/>
+      <w:numFmt w:val="bullet"/>
+      <w:lvlText w:val=""/>
+      <w:lvlJc w:val="left"/>
+      <w:pPr>
+        <w:tabs>
+          <w:tab w:val="num" w:pos="6480"/>
+        </w:tabs>
+        <w:ind w:left="6480" w:hanging="360"/>
+      </w:pPr>
+      <w:rPr>
+        <w:rFonts w:ascii="Wingdings" w:hAnsi="Wingdings" w:hint="default"/>
+        <w:sz w:val="20"/>
+      </w:rPr>
+    </w:lvl>
+  </w:abstractNum>
+  <w:abstractNum w:abstractNumId="4" w15:restartNumberingAfterBreak="0">
     <w:nsid w:val="6A72615F"/>
     <w:multiLevelType w:val="multilevel"/>
     <w:tmpl w:val="983497E8"/>
@@ -4371,7 +6580,7 @@
       </w:pPr>
     </w:lvl>
   </w:abstractNum>
-  <w:abstractNum w:abstractNumId="3" w15:restartNumberingAfterBreak="0">
+  <w:abstractNum w:abstractNumId="5" w15:restartNumberingAfterBreak="0">
     <w:nsid w:val="7710752F"/>
     <w:multiLevelType w:val="multilevel"/>
     <w:tmpl w:val="A0D21B22"/>
@@ -4520,7 +6729,7 @@
       </w:rPr>
     </w:lvl>
   </w:abstractNum>
-  <w:abstractNum w:abstractNumId="4" w15:restartNumberingAfterBreak="0">
+  <w:abstractNum w:abstractNumId="6" w15:restartNumberingAfterBreak="0">
     <w:nsid w:val="7AC07301"/>
     <w:multiLevelType w:val="multilevel"/>
     <w:tmpl w:val="5C60449A"/>
@@ -4669,7 +6878,7 @@
       </w:rPr>
     </w:lvl>
   </w:abstractNum>
-  <w:abstractNum w:abstractNumId="5" w15:restartNumberingAfterBreak="0">
+  <w:abstractNum w:abstractNumId="7" w15:restartNumberingAfterBreak="0">
     <w:nsid w:val="7C245108"/>
     <w:multiLevelType w:val="multilevel"/>
     <w:tmpl w:val="E20A2414"/>
@@ -4822,19 +7031,25 @@
     <w:abstractNumId w:val="0"/>
   </w:num>
   <w:num w:numId="2" w16cid:durableId="1511095272">
-    <w:abstractNumId w:val="1"/>
+    <w:abstractNumId w:val="2"/>
   </w:num>
   <w:num w:numId="3" w16cid:durableId="737872292">
+    <w:abstractNumId w:val="7"/>
+  </w:num>
+  <w:num w:numId="4" w16cid:durableId="181285380">
+    <w:abstractNumId w:val="6"/>
+  </w:num>
+  <w:num w:numId="5" w16cid:durableId="789057349">
     <w:abstractNumId w:val="5"/>
   </w:num>
-  <w:num w:numId="4" w16cid:durableId="181285380">
+  <w:num w:numId="6" w16cid:durableId="463816503">
     <w:abstractNumId w:val="4"/>
   </w:num>
-  <w:num w:numId="5" w16cid:durableId="789057349">
+  <w:num w:numId="7" w16cid:durableId="767820616">
     <w:abstractNumId w:val="3"/>
   </w:num>
-  <w:num w:numId="6" w16cid:durableId="463816503">
-    <w:abstractNumId w:val="2"/>
+  <w:num w:numId="8" w16cid:durableId="2015842231">
+    <w:abstractNumId w:val="1"/>
   </w:num>
 </w:numbering>
 </file>

</xml_diff>